<commit_message>
Align technical PRD with live MVP implementation
</commit_message>
<xml_diff>
--- a/documentation/NetraJyoti_AI_Technical_PRD.docx
+++ b/documentation/NetraJyoti_AI_Technical_PRD.docx
@@ -39,7 +39,7 @@
           <w:color w:val="263D48"/>
           <w:sz w:val="20"/>
         </w:rPr>
-        <w:t>A Bengali-first, safety-guidance MVP for people seeking appropriate eye-care services in rural West Bengal. The product provides safe next-step guidance and care navigation; it does not diagnose eye disease.</w:t>
+        <w:t>A Bengali-first, deterministic safety-guidance MVP for people seeking appropriate eye-care next steps in rural West Bengal. It provides care navigation and does not diagnose eye disease.</w:t>
       </w:r>
     </w:p>
     <w:tbl>
@@ -121,7 +121,9 @@
             <w:pPr>
               <w:spacing w:after="40"/>
             </w:pPr>
-            <w:r/>
+            <w:r>
+              <w:t>Document control</w:t>
+            </w:r>
             <w:r>
               <w:rPr>
                 <w:rFonts w:ascii="Aptos" w:hAnsi="Aptos"/>
@@ -129,7 +131,6 @@
                 <w:color w:val="FFFFFF"/>
                 <w:sz w:val="17"/>
               </w:rPr>
-              <w:t>Document control</w:t>
             </w:r>
           </w:p>
         </w:tc>
@@ -149,7 +150,9 @@
             <w:pPr>
               <w:spacing w:after="40"/>
             </w:pPr>
-            <w:r/>
+            <w:r>
+              <w:t>Value</w:t>
+            </w:r>
             <w:r>
               <w:rPr>
                 <w:rFonts w:ascii="Aptos" w:hAnsi="Aptos"/>
@@ -157,7 +160,6 @@
                 <w:color w:val="FFFFFF"/>
                 <w:sz w:val="17"/>
               </w:rPr>
-              <w:t>Value</w:t>
             </w:r>
           </w:p>
         </w:tc>
@@ -178,14 +180,15 @@
             <w:pPr>
               <w:spacing w:after="40"/>
             </w:pPr>
-            <w:r/>
+            <w:r>
+              <w:t>Product</w:t>
+            </w:r>
             <w:r>
               <w:rPr>
                 <w:rFonts w:ascii="Aptos" w:hAnsi="Aptos"/>
                 <w:b w:val="0"/>
                 <w:sz w:val="17"/>
               </w:rPr>
-              <w:t>Product</w:t>
             </w:r>
           </w:p>
         </w:tc>
@@ -204,14 +207,15 @@
             <w:pPr>
               <w:spacing w:after="40"/>
             </w:pPr>
-            <w:r/>
+            <w:r>
+              <w:t>NetraJyoti AI MVP</w:t>
+            </w:r>
             <w:r>
               <w:rPr>
                 <w:rFonts w:ascii="Aptos" w:hAnsi="Aptos"/>
                 <w:b w:val="0"/>
                 <w:sz w:val="17"/>
               </w:rPr>
-              <w:t>NetraJyoti AI MVP</w:t>
             </w:r>
           </w:p>
         </w:tc>
@@ -233,14 +237,15 @@
             <w:pPr>
               <w:spacing w:after="40"/>
             </w:pPr>
-            <w:r/>
+            <w:r>
+              <w:t>Version</w:t>
+            </w:r>
             <w:r>
               <w:rPr>
                 <w:rFonts w:ascii="Aptos" w:hAnsi="Aptos"/>
                 <w:b w:val="0"/>
                 <w:sz w:val="17"/>
               </w:rPr>
-              <w:t>Version</w:t>
             </w:r>
           </w:p>
         </w:tc>
@@ -260,14 +265,15 @@
             <w:pPr>
               <w:spacing w:after="40"/>
             </w:pPr>
-            <w:r/>
+            <w:r>
+              <w:t>1.1 - 3 September 2026</w:t>
+            </w:r>
             <w:r>
               <w:rPr>
                 <w:rFonts w:ascii="Aptos" w:hAnsi="Aptos"/>
                 <w:b w:val="0"/>
                 <w:sz w:val="17"/>
               </w:rPr>
-              <w:t>1.0</w:t>
             </w:r>
           </w:p>
         </w:tc>
@@ -288,14 +294,15 @@
             <w:pPr>
               <w:spacing w:after="40"/>
             </w:pPr>
-            <w:r/>
+            <w:r>
+              <w:t>Primary language</w:t>
+            </w:r>
             <w:r>
               <w:rPr>
                 <w:rFonts w:ascii="Aptos" w:hAnsi="Aptos"/>
                 <w:b w:val="0"/>
                 <w:sz w:val="17"/>
               </w:rPr>
-              <w:t>Primary language</w:t>
             </w:r>
           </w:p>
         </w:tc>
@@ -314,14 +321,15 @@
             <w:pPr>
               <w:spacing w:after="40"/>
             </w:pPr>
-            <w:r/>
+            <w:r>
+              <w:t>Bengali-first interface with smaller English support text</w:t>
+            </w:r>
             <w:r>
               <w:rPr>
                 <w:rFonts w:ascii="Aptos" w:hAnsi="Aptos"/>
                 <w:b w:val="0"/>
                 <w:sz w:val="17"/>
               </w:rPr>
-              <w:t>Bengali-first interface with smaller English support text</w:t>
             </w:r>
           </w:p>
         </w:tc>
@@ -343,14 +351,15 @@
             <w:pPr>
               <w:spacing w:after="40"/>
             </w:pPr>
-            <w:r/>
+            <w:r>
+              <w:t>Client</w:t>
+            </w:r>
             <w:r>
               <w:rPr>
                 <w:rFonts w:ascii="Aptos" w:hAnsi="Aptos"/>
                 <w:b w:val="0"/>
                 <w:sz w:val="17"/>
               </w:rPr>
-              <w:t>Client</w:t>
             </w:r>
           </w:p>
         </w:tc>
@@ -370,14 +379,15 @@
             <w:pPr>
               <w:spacing w:after="40"/>
             </w:pPr>
-            <w:r/>
+            <w:r>
+              <w:t>React + TypeScript + Vite + Tailwind CSS / PWA-ready web client</w:t>
+            </w:r>
             <w:r>
               <w:rPr>
                 <w:rFonts w:ascii="Aptos" w:hAnsi="Aptos"/>
                 <w:b w:val="0"/>
                 <w:sz w:val="17"/>
               </w:rPr>
-              <w:t>React + TypeScript + Vite + Tailwind CSS / PWA-ready web client</w:t>
             </w:r>
           </w:p>
         </w:tc>
@@ -398,14 +408,15 @@
             <w:pPr>
               <w:spacing w:after="40"/>
             </w:pPr>
-            <w:r/>
+            <w:r>
+              <w:t>Server</w:t>
+            </w:r>
             <w:r>
               <w:rPr>
                 <w:rFonts w:ascii="Aptos" w:hAnsi="Aptos"/>
                 <w:b w:val="0"/>
                 <w:sz w:val="17"/>
               </w:rPr>
-              <w:t>Server</w:t>
             </w:r>
           </w:p>
         </w:tc>
@@ -424,14 +435,15 @@
             <w:pPr>
               <w:spacing w:after="40"/>
             </w:pPr>
-            <w:r/>
+            <w:r>
+              <w:t>Java 21 + Spring Boot 3 REST API</w:t>
+            </w:r>
             <w:r>
               <w:rPr>
                 <w:rFonts w:ascii="Aptos" w:hAnsi="Aptos"/>
                 <w:b w:val="0"/>
                 <w:sz w:val="17"/>
               </w:rPr>
-              <w:t>Java 21 + Spring Boot 3 REST API</w:t>
             </w:r>
           </w:p>
         </w:tc>
@@ -453,14 +465,15 @@
             <w:pPr>
               <w:spacing w:after="40"/>
             </w:pPr>
-            <w:r/>
+            <w:r>
+              <w:t>Data</w:t>
+            </w:r>
             <w:r>
               <w:rPr>
                 <w:rFonts w:ascii="Aptos" w:hAnsi="Aptos"/>
                 <w:b w:val="0"/>
                 <w:sz w:val="17"/>
               </w:rPr>
-              <w:t>Data</w:t>
             </w:r>
           </w:p>
         </w:tc>
@@ -480,14 +493,15 @@
             <w:pPr>
               <w:spacing w:after="40"/>
             </w:pPr>
-            <w:r/>
+            <w:r>
+              <w:t>PostgreSQL clinical source, pathway, criterion, guidance, and linkage tables; JdbcTemplate retrieval for routing/RAG</w:t>
+            </w:r>
             <w:r>
               <w:rPr>
                 <w:rFonts w:ascii="Aptos" w:hAnsi="Aptos"/>
                 <w:b w:val="0"/>
                 <w:sz w:val="17"/>
               </w:rPr>
-              <w:t>PostgreSQL with Spring Data JPA / Hibernate</w:t>
             </w:r>
           </w:p>
         </w:tc>
@@ -508,14 +522,15 @@
             <w:pPr>
               <w:spacing w:after="40"/>
             </w:pPr>
-            <w:r/>
+            <w:r>
+              <w:t>Safety posture</w:t>
+            </w:r>
             <w:r>
               <w:rPr>
                 <w:rFonts w:ascii="Aptos" w:hAnsi="Aptos"/>
                 <w:b w:val="0"/>
                 <w:sz w:val="17"/>
               </w:rPr>
-              <w:t>Safety posture</w:t>
             </w:r>
           </w:p>
         </w:tc>
@@ -534,14 +549,15 @@
             <w:pPr>
               <w:spacing w:after="40"/>
             </w:pPr>
-            <w:r/>
+            <w:r>
+              <w:t>Java fixes the route from allowlisted UI codes and matching PostgreSQL criteria; Ollama cannot select or change it</w:t>
+            </w:r>
             <w:r>
               <w:rPr>
                 <w:rFonts w:ascii="Aptos" w:hAnsi="Aptos"/>
                 <w:b w:val="0"/>
                 <w:sz w:val="17"/>
               </w:rPr>
-              <w:t>Deterministic reviewed rules decide urgency; AI never decides urgency or diagnoses</w:t>
             </w:r>
           </w:p>
         </w:tc>
@@ -563,14 +579,15 @@
             <w:pPr>
               <w:spacing w:after="40"/>
             </w:pPr>
-            <w:r/>
+            <w:r>
+              <w:t>Status</w:t>
+            </w:r>
             <w:r>
               <w:rPr>
                 <w:rFonts w:ascii="Aptos" w:hAnsi="Aptos"/>
                 <w:b w:val="0"/>
                 <w:sz w:val="17"/>
               </w:rPr>
-              <w:t>Status</w:t>
             </w:r>
           </w:p>
         </w:tc>
@@ -590,14 +607,15 @@
             <w:pPr>
               <w:spacing w:after="40"/>
             </w:pPr>
-            <w:r/>
+            <w:r>
+              <w:t>Live capstone implementation baseline; pilot production controls are explicitly marked as release gates</w:t>
+            </w:r>
             <w:r>
               <w:rPr>
                 <w:rFonts w:ascii="Aptos" w:hAnsi="Aptos"/>
                 <w:b w:val="0"/>
                 <w:sz w:val="17"/>
               </w:rPr>
-              <w:t>MVP technical baseline</w:t>
             </w:r>
           </w:p>
         </w:tc>
@@ -631,7 +649,7 @@
           <w:color w:val="263D48"/>
           <w:sz w:val="20"/>
         </w:rPr>
-        <w:t>NetraJyoti AI addresses the delay, fear, and confusion experienced by Bengali-speaking users who are unsure whether an eye concern needs urgent attention, where to seek care, and which advice to trust. The application turns a short guided interaction into a safe, explainable next step: urgent eye-care advice, routine vision/eye-check guidance, or human-support guidance.</w:t>
+        <w:t>NetraJyoti AI addresses delay, fear, and confusion for Bengali-speaking users who are unsure where to seek eye care. A short guided interaction produces one fixed safe route: urgent eye care, routine eye-care guidance, or human support.</w:t>
       </w:r>
     </w:p>
     <w:p>
@@ -644,7 +662,7 @@
           <w:color w:val="263D48"/>
           <w:sz w:val="20"/>
         </w:rPr>
-        <w:t>The system is intentionally an information and care-navigation product. It must never present a disease label, claim clinical diagnosis, or allow generative AI to override reviewed safety rules.</w:t>
+        <w:t>The live MVP is an information and care-navigation product. It never presents a disease label, claims clinical diagnosis, or lets generative AI select or change the route.</w:t>
       </w:r>
     </w:p>
     <w:p>
@@ -670,7 +688,7 @@
           <w:rFonts w:ascii="Aptos" w:hAnsi="Aptos"/>
           <w:sz w:val="20"/>
         </w:rPr>
-        <w:t>Give Bengali-speaking users a low-literacy-friendly, mobile-first way to describe fixed eye symptoms.</w:t>
+        <w:t>Give Bengali-speaking users a low-literacy-friendly, mobile-first way to select fixed eye-concern options.</w:t>
       </w:r>
     </w:p>
     <w:p>
@@ -683,7 +701,7 @@
           <w:rFonts w:ascii="Aptos" w:hAnsi="Aptos"/>
           <w:sz w:val="20"/>
         </w:rPr>
-        <w:t>Identify urgent warning signs through deterministic, reviewed rules and immediately route to urgent care guidance.</w:t>
+        <w:t>Use Java deterministic routing with PostgreSQL criteria to select URGENT, ROUTINE, or HUMAN_SUPPORT.</w:t>
       </w:r>
     </w:p>
     <w:p>
@@ -696,7 +714,7 @@
           <w:rFonts w:ascii="Aptos" w:hAnsi="Aptos"/>
           <w:sz w:val="20"/>
         </w:rPr>
-        <w:t>Offer practical service navigation: verified-care discovery, district/town selection, PHC referral, eye clinic/vision centre direction, family sharing, and human support.</w:t>
+        <w:t>Provide demo district/town or block selection, static demo eye-care options, family sharing, and a human-support route.</w:t>
       </w:r>
     </w:p>
     <w:p>
@@ -709,7 +727,7 @@
           <w:rFonts w:ascii="Aptos" w:hAnsi="Aptos"/>
           <w:sz w:val="20"/>
         </w:rPr>
-        <w:t>Create a concise caregiver message containing selected symptoms, approved next step, and optional consented patient information.</w:t>
+        <w:t>Show selected concerns and the fixed route with bilingual, approved next-step guidance.</w:t>
       </w:r>
     </w:p>
     <w:p>
@@ -722,7 +740,7 @@
           <w:rFonts w:ascii="Aptos" w:hAnsi="Aptos"/>
           <w:sz w:val="20"/>
         </w:rPr>
-        <w:t>Use controlled AI only to improve the routine caregiver summary after deterministic routing and backend safety validation.</w:t>
+        <w:t>Optionally use local Ollama only after the route is fixed to create a short Bengali explanation that Java validates against safe policy.</w:t>
       </w:r>
     </w:p>
     <w:p>
@@ -769,7 +787,9 @@
             <w:pPr>
               <w:spacing w:after="40"/>
             </w:pPr>
-            <w:r/>
+            <w:r>
+              <w:t>In MVP scope</w:t>
+            </w:r>
             <w:r>
               <w:rPr>
                 <w:rFonts w:ascii="Aptos" w:hAnsi="Aptos"/>
@@ -777,7 +797,6 @@
                 <w:color w:val="FFFFFF"/>
                 <w:sz w:val="17"/>
               </w:rPr>
-              <w:t>In MVP scope</w:t>
             </w:r>
           </w:p>
         </w:tc>
@@ -797,7 +816,9 @@
             <w:pPr>
               <w:spacing w:after="40"/>
             </w:pPr>
-            <w:r/>
+            <w:r>
+              <w:t>Out of scope / prohibited</w:t>
+            </w:r>
             <w:r>
               <w:rPr>
                 <w:rFonts w:ascii="Aptos" w:hAnsi="Aptos"/>
@@ -805,7 +826,6 @@
                 <w:color w:val="FFFFFF"/>
                 <w:sz w:val="17"/>
               </w:rPr>
-              <w:t>Out of scope / prohibited</w:t>
             </w:r>
           </w:p>
         </w:tc>
@@ -826,14 +846,15 @@
             <w:pPr>
               <w:spacing w:after="40"/>
             </w:pPr>
-            <w:r/>
+            <w:r>
+              <w:t>Bengali-first fixed-option journey, optional browser speech/text context, deterministic route, selected concerns, static demo directions, sharing/copy, and restart.</w:t>
+            </w:r>
             <w:r>
               <w:rPr>
                 <w:rFonts w:ascii="Aptos" w:hAnsi="Aptos"/>
                 <w:b w:val="0"/>
                 <w:sz w:val="17"/>
               </w:rPr>
-              <w:t>Bengali-first symptom selection, optional voice/text capture, reviewed safety route, service direction, caregiver message and share/copy.</w:t>
             </w:r>
           </w:p>
         </w:tc>
@@ -852,14 +873,15 @@
             <w:pPr>
               <w:spacing w:after="40"/>
             </w:pPr>
-            <w:r/>
+            <w:r>
+              <w:t>Disease diagnosis, medication recommendation, treatment plan, triage model training, or autonomous clinical decision-making.</w:t>
+            </w:r>
             <w:r>
               <w:rPr>
                 <w:rFonts w:ascii="Aptos" w:hAnsi="Aptos"/>
                 <w:b w:val="0"/>
                 <w:sz w:val="17"/>
               </w:rPr>
-              <w:t>Disease diagnosis, medication recommendation, treatment plan, triage model training, or autonomous clinical decision-making.</w:t>
             </w:r>
           </w:p>
         </w:tc>
@@ -881,14 +903,15 @@
             <w:pPr>
               <w:spacing w:after="40"/>
             </w:pPr>
-            <w:r/>
+            <w:r>
+              <w:t>Demo district/town or block selection and static demo facility cards in React. PostgreSQL service_locations is reserved but not wired to the UI.</w:t>
+            </w:r>
             <w:r>
               <w:rPr>
                 <w:rFonts w:ascii="Aptos" w:hAnsi="Aptos"/>
                 <w:b w:val="0"/>
                 <w:sz w:val="17"/>
               </w:rPr>
-              <w:t>Demo district/town or block service selection and curated demo facility data.</w:t>
             </w:r>
           </w:p>
         </w:tc>
@@ -908,14 +931,15 @@
             <w:pPr>
               <w:spacing w:after="40"/>
             </w:pPr>
-            <w:r/>
+            <w:r>
+              <w:t>Claims that availability, hours, addresses, or facility details are live/verified unless an approved directory integration is introduced.</w:t>
+            </w:r>
             <w:r>
               <w:rPr>
                 <w:rFonts w:ascii="Aptos" w:hAnsi="Aptos"/>
                 <w:b w:val="0"/>
                 <w:sz w:val="17"/>
               </w:rPr>
-              <w:t>Claims that availability, hours, or facility details are live unless an approved directory integration is introduced.</w:t>
             </w:r>
           </w:p>
         </w:tc>
@@ -936,14 +960,15 @@
             <w:pPr>
               <w:spacing w:after="40"/>
             </w:pPr>
-            <w:r/>
+            <w:r>
+              <w:t>Optional local Ollama Bengali route explanation after PostgreSQL guidance retrieval and Java policy validation/fallback.</w:t>
+            </w:r>
             <w:r>
               <w:rPr>
                 <w:rFonts w:ascii="Aptos" w:hAnsi="Aptos"/>
                 <w:b w:val="0"/>
                 <w:sz w:val="17"/>
               </w:rPr>
-              <w:t>Optional OpenAI-generated caregiver summary behind a feature flag and server validation.</w:t>
             </w:r>
           </w:p>
         </w:tc>
@@ -962,14 +987,15 @@
             <w:pPr>
               <w:spacing w:after="40"/>
             </w:pPr>
-            <w:r/>
+            <w:r>
+              <w:t>Sending raw free-text, recorded audio, or patient details to an external service without a separately approved privacy and consent design.</w:t>
+            </w:r>
             <w:r>
               <w:rPr>
                 <w:rFonts w:ascii="Aptos" w:hAnsi="Aptos"/>
                 <w:b w:val="0"/>
                 <w:sz w:val="17"/>
               </w:rPr>
-              <w:t>Sending raw free-text, recording audio, or patient details to AI without an approved privacy and consent design.</w:t>
             </w:r>
           </w:p>
         </w:tc>
@@ -991,14 +1017,15 @@
             <w:pPr>
               <w:spacing w:after="40"/>
             </w:pPr>
-            <w:r/>
+            <w:r>
+              <w:t>PWA-capable browser experience.</w:t>
+            </w:r>
             <w:r>
               <w:rPr>
                 <w:rFonts w:ascii="Aptos" w:hAnsi="Aptos"/>
                 <w:b w:val="0"/>
                 <w:sz w:val="17"/>
               </w:rPr>
-              <w:t>PWA-capable browser experience.</w:t>
             </w:r>
           </w:p>
         </w:tc>
@@ -1018,14 +1045,15 @@
             <w:pPr>
               <w:spacing w:after="40"/>
             </w:pPr>
-            <w:r/>
+            <w:r>
+              <w:t>Native mobile application-store distribution in the MVP.</w:t>
+            </w:r>
             <w:r>
               <w:rPr>
                 <w:rFonts w:ascii="Aptos" w:hAnsi="Aptos"/>
                 <w:b w:val="0"/>
                 <w:sz w:val="17"/>
               </w:rPr>
-              <w:t>Native mobile application store distribution in MVP.</w:t>
             </w:r>
           </w:p>
         </w:tc>
@@ -1064,7 +1092,7 @@
           <w:color w:val="263D48"/>
           <w:sz w:val="20"/>
         </w:rPr>
-        <w:t>The application must preserve the following deterministic workflow. The UI wireframe labels each screen with its entry trigger to make the route auditable during product review and testing.</w:t>
+        <w:t>The live MVP preserves this deterministic workflow. Screen identifiers support capstone review; the browser keeps only transient journey state and every result offers back or restart navigation.</w:t>
       </w:r>
     </w:p>
     <w:tbl>
@@ -1099,7 +1127,9 @@
             <w:pPr>
               <w:spacing w:after="40"/>
             </w:pPr>
-            <w:r/>
+            <w:r>
+              <w:t>Stage</w:t>
+            </w:r>
             <w:r>
               <w:rPr>
                 <w:rFonts w:ascii="Aptos" w:hAnsi="Aptos"/>
@@ -1107,7 +1137,6 @@
                 <w:color w:val="FFFFFF"/>
                 <w:sz w:val="17"/>
               </w:rPr>
-              <w:t>Stage</w:t>
             </w:r>
           </w:p>
         </w:tc>
@@ -1127,7 +1156,9 @@
             <w:pPr>
               <w:spacing w:after="40"/>
             </w:pPr>
-            <w:r/>
+            <w:r>
+              <w:t>User/system action</w:t>
+            </w:r>
             <w:r>
               <w:rPr>
                 <w:rFonts w:ascii="Aptos" w:hAnsi="Aptos"/>
@@ -1135,7 +1166,6 @@
                 <w:color w:val="FFFFFF"/>
                 <w:sz w:val="17"/>
               </w:rPr>
-              <w:t>User/system action</w:t>
             </w:r>
           </w:p>
         </w:tc>
@@ -1155,7 +1185,9 @@
             <w:pPr>
               <w:spacing w:after="40"/>
             </w:pPr>
-            <w:r/>
+            <w:r>
+              <w:t>Transition rule</w:t>
+            </w:r>
             <w:r>
               <w:rPr>
                 <w:rFonts w:ascii="Aptos" w:hAnsi="Aptos"/>
@@ -1163,7 +1195,6 @@
                 <w:color w:val="FFFFFF"/>
                 <w:sz w:val="17"/>
               </w:rPr>
-              <w:t>Transition rule</w:t>
             </w:r>
           </w:p>
         </w:tc>
@@ -1184,14 +1215,15 @@
             <w:pPr>
               <w:spacing w:after="40"/>
             </w:pPr>
-            <w:r/>
+            <w:r>
+              <w:t>1. Consent</w:t>
+            </w:r>
             <w:r>
               <w:rPr>
                 <w:rFonts w:ascii="Aptos" w:hAnsi="Aptos"/>
                 <w:b w:val="0"/>
                 <w:sz w:val="17"/>
               </w:rPr>
-              <w:t>1. Consent</w:t>
             </w:r>
           </w:p>
         </w:tc>
@@ -1210,14 +1242,15 @@
             <w:pPr>
               <w:spacing w:after="40"/>
             </w:pPr>
-            <w:r/>
+            <w:r>
+              <w:t>User reads value and safety notice, then selects consent.</w:t>
+            </w:r>
             <w:r>
               <w:rPr>
                 <w:rFonts w:ascii="Aptos" w:hAnsi="Aptos"/>
                 <w:b w:val="0"/>
                 <w:sz w:val="17"/>
               </w:rPr>
-              <w:t>User reads value and safety notice, then selects consent.</w:t>
             </w:r>
           </w:p>
         </w:tc>
@@ -1236,14 +1269,15 @@
             <w:pPr>
               <w:spacing w:after="40"/>
             </w:pPr>
-            <w:r/>
+            <w:r>
+              <w:t>Consent enables Start safely. No patient details are requested.</w:t>
+            </w:r>
             <w:r>
               <w:rPr>
                 <w:rFonts w:ascii="Aptos" w:hAnsi="Aptos"/>
                 <w:b w:val="0"/>
                 <w:sz w:val="17"/>
               </w:rPr>
-              <w:t>Consent enables “Start safely”. No patient details are requested.</w:t>
             </w:r>
           </w:p>
         </w:tc>
@@ -1265,14 +1299,15 @@
             <w:pPr>
               <w:spacing w:after="40"/>
             </w:pPr>
-            <w:r/>
+            <w:r>
+              <w:t>2. Concerns</w:t>
+            </w:r>
             <w:r>
               <w:rPr>
                 <w:rFonts w:ascii="Aptos" w:hAnsi="Aptos"/>
                 <w:b w:val="0"/>
                 <w:sz w:val="17"/>
               </w:rPr>
-              <w:t>2. Symptoms</w:t>
             </w:r>
           </w:p>
         </w:tc>
@@ -1292,14 +1327,15 @@
             <w:pPr>
               <w:spacing w:after="40"/>
             </w:pPr>
-            <w:r/>
+            <w:r>
+              <w:t>User selects one or more fixed concern options; voice/text is optional context.</w:t>
+            </w:r>
             <w:r>
               <w:rPr>
                 <w:rFonts w:ascii="Aptos" w:hAnsi="Aptos"/>
                 <w:b w:val="0"/>
                 <w:sz w:val="17"/>
               </w:rPr>
-              <w:t>User selects one or more fixed symptom options; voice/text is optional context.</w:t>
             </w:r>
           </w:p>
         </w:tc>
@@ -1319,14 +1355,15 @@
             <w:pPr>
               <w:spacing w:after="40"/>
             </w:pPr>
-            <w:r/>
+            <w:r>
+              <w:t>Selections move to urgent-warning review. Free text does not select a route.</w:t>
+            </w:r>
             <w:r>
               <w:rPr>
                 <w:rFonts w:ascii="Aptos" w:hAnsi="Aptos"/>
                 <w:b w:val="0"/>
                 <w:sz w:val="17"/>
               </w:rPr>
-              <w:t>Submitted selections move to warning-sign review. Optional detail never sets urgency.</w:t>
             </w:r>
           </w:p>
         </w:tc>
@@ -1347,14 +1384,15 @@
             <w:pPr>
               <w:spacing w:after="40"/>
             </w:pPr>
-            <w:r/>
+            <w:r>
+              <w:t>3 / 3A. Urgent and history</w:t>
+            </w:r>
             <w:r>
               <w:rPr>
                 <w:rFonts w:ascii="Aptos" w:hAnsi="Aptos"/>
                 <w:b w:val="0"/>
                 <w:sz w:val="17"/>
               </w:rPr>
-              <w:t>3. Urgent warning check</w:t>
             </w:r>
           </w:p>
         </w:tc>
@@ -1373,14 +1411,15 @@
             <w:pPr>
               <w:spacing w:after="40"/>
             </w:pPr>
-            <w:r/>
+            <w:r>
+              <w:t>User answers urgent-warning questions and may select optional eye-care history.</w:t>
+            </w:r>
             <w:r>
               <w:rPr>
                 <w:rFonts w:ascii="Aptos" w:hAnsi="Aptos"/>
                 <w:b w:val="0"/>
                 <w:sz w:val="17"/>
               </w:rPr>
-              <w:t>User answers urgent-warning questions.</w:t>
             </w:r>
           </w:p>
         </w:tc>
@@ -1399,14 +1438,15 @@
             <w:pPr>
               <w:spacing w:after="40"/>
             </w:pPr>
-            <w:r/>
+            <w:r>
+              <w:t>Java evaluates only allowlisted codes. In current seed data, history is retrieved but does not change a route.</w:t>
+            </w:r>
             <w:r>
               <w:rPr>
                 <w:rFonts w:ascii="Aptos" w:hAnsi="Aptos"/>
                 <w:b w:val="0"/>
                 <w:sz w:val="17"/>
               </w:rPr>
-              <w:t>Reviewed rules prepare one of three safe routes.</w:t>
             </w:r>
           </w:p>
         </w:tc>
@@ -1428,14 +1468,15 @@
             <w:pPr>
               <w:spacing w:after="40"/>
             </w:pPr>
-            <w:r/>
+            <w:r>
+              <w:t>4. Safe guidance</w:t>
+            </w:r>
             <w:r>
               <w:rPr>
                 <w:rFonts w:ascii="Aptos" w:hAnsi="Aptos"/>
                 <w:b w:val="0"/>
                 <w:sz w:val="17"/>
               </w:rPr>
-              <w:t>4. Safe guidance check</w:t>
             </w:r>
           </w:p>
         </w:tc>
@@ -1455,14 +1496,15 @@
             <w:pPr>
               <w:spacing w:after="40"/>
             </w:pPr>
-            <w:r/>
+            <w:r>
+              <w:t>Browser calls Java route evaluation and displays the result.</w:t>
+            </w:r>
             <w:r>
               <w:rPr>
                 <w:rFonts w:ascii="Aptos" w:hAnsi="Aptos"/>
                 <w:b w:val="0"/>
                 <w:sz w:val="17"/>
               </w:rPr>
-              <w:t>UI confirms data received and warning signs checked.</w:t>
             </w:r>
           </w:p>
         </w:tc>
@@ -1482,14 +1524,15 @@
             <w:pPr>
               <w:spacing w:after="40"/>
             </w:pPr>
-            <w:r/>
+            <w:r>
+              <w:t>Java retrieves PostgreSQL criteria, then returns URGENT, ROUTINE, or HUMAN_SUPPORT. Urgent has precedence.</w:t>
+            </w:r>
             <w:r>
               <w:rPr>
                 <w:rFonts w:ascii="Aptos" w:hAnsi="Aptos"/>
                 <w:b w:val="0"/>
                 <w:sz w:val="17"/>
               </w:rPr>
-              <w:t>Urgent → 5A; routine → 5B; unclear/human support → 5C.</w:t>
             </w:r>
           </w:p>
         </w:tc>
@@ -1510,14 +1553,15 @@
             <w:pPr>
               <w:spacing w:after="40"/>
             </w:pPr>
-            <w:r/>
+            <w:r>
+              <w:t>5A urgent</w:t>
+            </w:r>
             <w:r>
               <w:rPr>
                 <w:rFonts w:ascii="Aptos" w:hAnsi="Aptos"/>
                 <w:b w:val="0"/>
                 <w:sz w:val="17"/>
               </w:rPr>
-              <w:t>5A urgent</w:t>
             </w:r>
           </w:p>
         </w:tc>
@@ -1536,14 +1580,15 @@
             <w:pPr>
               <w:spacing w:after="40"/>
             </w:pPr>
-            <w:r/>
+            <w:r>
+              <w:t>Immediate care advice, static demo care-direction paths, sharing, or care confirmation.</w:t>
+            </w:r>
             <w:r>
               <w:rPr>
                 <w:rFonts w:ascii="Aptos" w:hAnsi="Aptos"/>
                 <w:b w:val="0"/>
                 <w:sz w:val="17"/>
               </w:rPr>
-              <w:t>Immediate care advice; navigation, family sharing, or care confirmation.</w:t>
             </w:r>
           </w:p>
         </w:tc>
@@ -1562,14 +1607,15 @@
             <w:pPr>
               <w:spacing w:after="40"/>
             </w:pPr>
-            <w:r/>
+            <w:r>
+              <w:t>Sub-paths 5A.1-5A.6 retain access to the urgent result.</w:t>
+            </w:r>
             <w:r>
               <w:rPr>
                 <w:rFonts w:ascii="Aptos" w:hAnsi="Aptos"/>
                 <w:b w:val="0"/>
                 <w:sz w:val="17"/>
               </w:rPr>
-              <w:t>Sub-paths 5A.1–5A.6 retain access to the urgent result.</w:t>
             </w:r>
           </w:p>
         </w:tc>
@@ -1591,14 +1637,15 @@
             <w:pPr>
               <w:spacing w:after="40"/>
             </w:pPr>
-            <w:r/>
+            <w:r>
+              <w:t>5B routine</w:t>
+            </w:r>
             <w:r>
               <w:rPr>
                 <w:rFonts w:ascii="Aptos" w:hAnsi="Aptos"/>
                 <w:b w:val="0"/>
                 <w:sz w:val="17"/>
               </w:rPr>
-              <w:t>5B routine</w:t>
             </w:r>
           </w:p>
         </w:tc>
@@ -1618,14 +1665,15 @@
             <w:pPr>
               <w:spacing w:after="40"/>
             </w:pPr>
-            <w:r/>
+            <w:r>
+              <w:t>User chooses district and town/block and sees routine visit guidance.</w:t>
+            </w:r>
             <w:r>
               <w:rPr>
                 <w:rFonts w:ascii="Aptos" w:hAnsi="Aptos"/>
                 <w:b w:val="0"/>
                 <w:sz w:val="17"/>
               </w:rPr>
-              <w:t>User chooses district and town/block.</w:t>
             </w:r>
           </w:p>
         </w:tc>
@@ -1645,14 +1693,15 @@
             <w:pPr>
               <w:spacing w:after="40"/>
             </w:pPr>
-            <w:r/>
+            <w:r>
+              <w:t>Step 6 shows the visit recommendation; Step 7 is the single facility-list screen.</w:t>
+            </w:r>
             <w:r>
               <w:rPr>
                 <w:rFonts w:ascii="Aptos" w:hAnsi="Aptos"/>
                 <w:b w:val="0"/>
                 <w:sz w:val="17"/>
               </w:rPr>
-              <w:t>Approved routine guidance opens Step 6.</w:t>
             </w:r>
           </w:p>
         </w:tc>
@@ -1673,14 +1722,15 @@
             <w:pPr>
               <w:spacing w:after="40"/>
             </w:pPr>
-            <w:r/>
+            <w:r>
+              <w:t>6-7 routine</w:t>
+            </w:r>
             <w:r>
               <w:rPr>
                 <w:rFonts w:ascii="Aptos" w:hAnsi="Aptos"/>
                 <w:b w:val="0"/>
                 <w:sz w:val="17"/>
               </w:rPr>
-              <w:t>6–8 routine</w:t>
             </w:r>
           </w:p>
         </w:tc>
@@ -1699,14 +1749,15 @@
             <w:pPr>
               <w:spacing w:after="40"/>
             </w:pPr>
-            <w:r/>
+            <w:r>
+              <w:t>Recommendation then service direction.</w:t>
+            </w:r>
             <w:r>
               <w:rPr>
                 <w:rFonts w:ascii="Aptos" w:hAnsi="Aptos"/>
                 <w:b w:val="0"/>
                 <w:sz w:val="17"/>
               </w:rPr>
-              <w:t>Recommendation → service direction → caregiver summary.</w:t>
             </w:r>
           </w:p>
         </w:tc>
@@ -1725,14 +1776,15 @@
             <w:pPr>
               <w:spacing w:after="40"/>
             </w:pPr>
-            <w:r/>
+            <w:r>
+              <w:t>No result-page audio is shown. The user can return or restart.</w:t>
+            </w:r>
             <w:r>
               <w:rPr>
                 <w:rFonts w:ascii="Aptos" w:hAnsi="Aptos"/>
                 <w:b w:val="0"/>
                 <w:sz w:val="17"/>
               </w:rPr>
-              <w:t>Patient details are optional and only used after explicit share consent.</w:t>
             </w:r>
           </w:p>
         </w:tc>
@@ -1754,14 +1806,15 @@
             <w:pPr>
               <w:spacing w:after="40"/>
             </w:pPr>
-            <w:r/>
+            <w:r>
+              <w:t>5C human support</w:t>
+            </w:r>
             <w:r>
               <w:rPr>
                 <w:rFonts w:ascii="Aptos" w:hAnsi="Aptos"/>
                 <w:b w:val="0"/>
                 <w:sz w:val="17"/>
               </w:rPr>
-              <w:t>5C human support</w:t>
             </w:r>
           </w:p>
         </w:tc>
@@ -1781,14 +1834,15 @@
             <w:pPr>
               <w:spacing w:after="40"/>
             </w:pPr>
-            <w:r/>
+            <w:r>
+              <w:t>User is guided to ASHA/PHC/trusted-family support.</w:t>
+            </w:r>
             <w:r>
               <w:rPr>
                 <w:rFonts w:ascii="Aptos" w:hAnsi="Aptos"/>
                 <w:b w:val="0"/>
                 <w:sz w:val="17"/>
               </w:rPr>
-              <w:t>User is guided to ASHA/PHC/trusted-family options.</w:t>
             </w:r>
           </w:p>
         </w:tc>
@@ -1808,14 +1862,15 @@
             <w:pPr>
               <w:spacing w:after="40"/>
             </w:pPr>
-            <w:r/>
+            <w:r>
+              <w:t>Static area selection and nearby-support demo content may be shown; user can restart.</w:t>
+            </w:r>
             <w:r>
               <w:rPr>
                 <w:rFonts w:ascii="Aptos" w:hAnsi="Aptos"/>
                 <w:b w:val="0"/>
                 <w:sz w:val="17"/>
               </w:rPr>
-              <w:t>Location/area can be used only to find nearby support.</w:t>
             </w:r>
           </w:p>
         </w:tc>
@@ -1919,7 +1974,9 @@
             <w:pPr>
               <w:spacing w:after="40"/>
             </w:pPr>
-            <w:r/>
+            <w:r>
+              <w:t>Route</w:t>
+            </w:r>
             <w:r>
               <w:rPr>
                 <w:rFonts w:ascii="Aptos" w:hAnsi="Aptos"/>
@@ -1927,7 +1984,6 @@
                 <w:color w:val="FFFFFF"/>
                 <w:sz w:val="17"/>
               </w:rPr>
-              <w:t>Route</w:t>
             </w:r>
           </w:p>
         </w:tc>
@@ -1947,7 +2003,9 @@
             <w:pPr>
               <w:spacing w:after="40"/>
             </w:pPr>
-            <w:r/>
+            <w:r>
+              <w:t>Entry condition</w:t>
+            </w:r>
             <w:r>
               <w:rPr>
                 <w:rFonts w:ascii="Aptos" w:hAnsi="Aptos"/>
@@ -1955,7 +2013,6 @@
                 <w:color w:val="FFFFFF"/>
                 <w:sz w:val="17"/>
               </w:rPr>
-              <w:t>Entry condition</w:t>
             </w:r>
           </w:p>
         </w:tc>
@@ -1975,7 +2032,9 @@
             <w:pPr>
               <w:spacing w:after="40"/>
             </w:pPr>
-            <w:r/>
+            <w:r>
+              <w:t>Required guidance and actions</w:t>
+            </w:r>
             <w:r>
               <w:rPr>
                 <w:rFonts w:ascii="Aptos" w:hAnsi="Aptos"/>
@@ -1983,7 +2042,6 @@
                 <w:color w:val="FFFFFF"/>
                 <w:sz w:val="17"/>
               </w:rPr>
-              <w:t>Required guidance and actions</w:t>
             </w:r>
           </w:p>
         </w:tc>
@@ -2004,14 +2062,15 @@
             <w:pPr>
               <w:spacing w:after="40"/>
             </w:pPr>
-            <w:r/>
+            <w:r>
+              <w:t>Urgent (5A)</w:t>
+            </w:r>
             <w:r>
               <w:rPr>
                 <w:rFonts w:ascii="Aptos" w:hAnsi="Aptos"/>
                 <w:b w:val="0"/>
                 <w:sz w:val="17"/>
               </w:rPr>
-              <w:t>Urgent (5A)</w:t>
             </w:r>
           </w:p>
         </w:tc>
@@ -2030,14 +2089,15 @@
             <w:pPr>
               <w:spacing w:after="40"/>
             </w:pPr>
-            <w:r/>
+            <w:r>
+              <w:t>At least one matching URGENT_IF_ANY PostgreSQL criterion, or a Java urgent fallback.</w:t>
+            </w:r>
             <w:r>
               <w:rPr>
                 <w:rFonts w:ascii="Aptos" w:hAnsi="Aptos"/>
                 <w:b w:val="0"/>
                 <w:sz w:val="17"/>
               </w:rPr>
-              <w:t>At least one reviewed urgent warning sign is selected.</w:t>
             </w:r>
           </w:p>
         </w:tc>
@@ -2056,14 +2116,15 @@
             <w:pPr>
               <w:spacing w:after="40"/>
             </w:pPr>
-            <w:r/>
+            <w:r>
+              <w:t>Show seek-eye-care-without-delay, selected concerns, static demo care-direction actions, family sharing, care confirmation, return, and restart.</w:t>
+            </w:r>
             <w:r>
               <w:rPr>
                 <w:rFonts w:ascii="Aptos" w:hAnsi="Aptos"/>
                 <w:b w:val="0"/>
                 <w:sz w:val="17"/>
               </w:rPr>
-              <w:t>Show “seek eye care without delay”, selected concerns, verified-care discovery, PHC support, family share, copy, care confirmation, and restart.</w:t>
             </w:r>
           </w:p>
         </w:tc>
@@ -2085,14 +2146,15 @@
             <w:pPr>
               <w:spacing w:after="40"/>
             </w:pPr>
-            <w:r/>
+            <w:r>
+              <w:t>Routine (5B-7)</w:t>
+            </w:r>
             <w:r>
               <w:rPr>
                 <w:rFonts w:ascii="Aptos" w:hAnsi="Aptos"/>
                 <w:b w:val="0"/>
                 <w:sz w:val="17"/>
               </w:rPr>
-              <w:t>Routine (5B–8)</w:t>
             </w:r>
           </w:p>
         </w:tc>
@@ -2112,14 +2174,15 @@
             <w:pPr>
               <w:spacing w:after="40"/>
             </w:pPr>
-            <w:r/>
+            <w:r>
+              <w:t>No urgent criterion; one or more matching ROUTINE_IF_ANY criteria.</w:t>
+            </w:r>
             <w:r>
               <w:rPr>
                 <w:rFonts w:ascii="Aptos" w:hAnsi="Aptos"/>
                 <w:b w:val="0"/>
                 <w:sz w:val="17"/>
               </w:rPr>
-              <w:t>No urgent warning sign; issue can follow approved routine route.</w:t>
             </w:r>
           </w:p>
         </w:tc>
@@ -2139,14 +2202,15 @@
             <w:pPr>
               <w:spacing w:after="40"/>
             </w:pPr>
-            <w:r/>
+            <w:r>
+              <w:t>Offer district/town selection, visit recommendation, service direction on Screen 7, sharing/copy, return, and restart.</w:t>
+            </w:r>
             <w:r>
               <w:rPr>
                 <w:rFonts w:ascii="Aptos" w:hAnsi="Aptos"/>
                 <w:b w:val="0"/>
                 <w:sz w:val="17"/>
               </w:rPr>
-              <w:t>Offer district/town selection, visit recommendation, service direction, listening support, caregiver summary, sharing, and restart.</w:t>
             </w:r>
           </w:p>
         </w:tc>
@@ -2167,14 +2231,15 @@
             <w:pPr>
               <w:spacing w:after="40"/>
             </w:pPr>
-            <w:r/>
+            <w:r>
+              <w:t>Human support (5C-5C.2)</w:t>
+            </w:r>
             <w:r>
               <w:rPr>
                 <w:rFonts w:ascii="Aptos" w:hAnsi="Aptos"/>
                 <w:b w:val="0"/>
                 <w:sz w:val="17"/>
               </w:rPr>
-              <w:t>Human support (5C–5C.2)</w:t>
             </w:r>
           </w:p>
         </w:tc>
@@ -2193,14 +2258,15 @@
             <w:pPr>
               <w:spacing w:after="40"/>
             </w:pPr>
-            <w:r/>
+            <w:r>
+              <w:t>Explicit needsHumanSupport request, OTHER concern, matching ESCALATE_IF_ANY criterion, or no eligible route.</w:t>
+            </w:r>
             <w:r>
               <w:rPr>
                 <w:rFonts w:ascii="Aptos" w:hAnsi="Aptos"/>
                 <w:b w:val="0"/>
                 <w:sz w:val="17"/>
               </w:rPr>
-              <w:t>Unclear concern, “other” response, or user requests human support.</w:t>
             </w:r>
           </w:p>
         </w:tc>
@@ -2219,14 +2285,15 @@
             <w:pPr>
               <w:spacing w:after="40"/>
             </w:pPr>
-            <w:r/>
+            <w:r>
+              <w:t>Explain local health-worker, PHC, eye-clinic, or trusted-family support; offer static area-based demo options and restart.</w:t>
+            </w:r>
             <w:r>
               <w:rPr>
                 <w:rFonts w:ascii="Aptos" w:hAnsi="Aptos"/>
                 <w:b w:val="0"/>
                 <w:sz w:val="17"/>
               </w:rPr>
-              <w:t>Explain that a local health worker, PHC, eye clinic, or trusted family member can help; offer area-based support discovery and sharing.</w:t>
             </w:r>
           </w:p>
         </w:tc>
@@ -3117,7 +3184,7 @@
           <w:color w:val="263D48"/>
           <w:sz w:val="20"/>
         </w:rPr>
-        <w:t>NetraJyoti is designed as a browser-based, API-driven application. The client retains transient interaction state while the server owns reviewed routing, controlled-AI validation, service-direction data APIs, and audit-ready telemetry. PostgreSQL is the system database for configuration and operational data; personally identifying details should not be persisted in the MVP unless a separate consent and retention design is approved.</w:t>
+        <w:t>NetraJyoti is a browser-based, API-driven capstone MVP. The client sends allowlisted selection codes. Java retrieves matching PostgreSQL criteria and fixes the route before optional local Ollama creates a short Bengali explanation from PostgreSQL route guidance. Java validates the explanation or returns fixed safe content. The demo does not persist patient details.</w:t>
       </w:r>
     </w:p>
     <w:tbl>
@@ -3152,7 +3219,9 @@
             <w:pPr>
               <w:spacing w:after="40"/>
             </w:pPr>
-            <w:r/>
+            <w:r>
+              <w:t>Layer</w:t>
+            </w:r>
             <w:r>
               <w:rPr>
                 <w:rFonts w:ascii="Aptos" w:hAnsi="Aptos"/>
@@ -3160,7 +3229,6 @@
                 <w:color w:val="FFFFFF"/>
                 <w:sz w:val="17"/>
               </w:rPr>
-              <w:t>Layer</w:t>
             </w:r>
           </w:p>
         </w:tc>
@@ -3180,7 +3248,9 @@
             <w:pPr>
               <w:spacing w:after="40"/>
             </w:pPr>
-            <w:r/>
+            <w:r>
+              <w:t>Technology</w:t>
+            </w:r>
             <w:r>
               <w:rPr>
                 <w:rFonts w:ascii="Aptos" w:hAnsi="Aptos"/>
@@ -3188,7 +3258,6 @@
                 <w:color w:val="FFFFFF"/>
                 <w:sz w:val="17"/>
               </w:rPr>
-              <w:t>Technology</w:t>
             </w:r>
           </w:p>
         </w:tc>
@@ -3208,7 +3277,9 @@
             <w:pPr>
               <w:spacing w:after="40"/>
             </w:pPr>
-            <w:r/>
+            <w:r>
+              <w:t>Live responsibilities</w:t>
+            </w:r>
             <w:r>
               <w:rPr>
                 <w:rFonts w:ascii="Aptos" w:hAnsi="Aptos"/>
@@ -3216,7 +3287,6 @@
                 <w:color w:val="FFFFFF"/>
                 <w:sz w:val="17"/>
               </w:rPr>
-              <w:t>Responsibilities</w:t>
             </w:r>
           </w:p>
         </w:tc>
@@ -3237,14 +3307,15 @@
             <w:pPr>
               <w:spacing w:after="40"/>
             </w:pPr>
-            <w:r/>
+            <w:r>
+              <w:t>Presentation</w:t>
+            </w:r>
             <w:r>
               <w:rPr>
                 <w:rFonts w:ascii="Aptos" w:hAnsi="Aptos"/>
                 <w:b w:val="0"/>
                 <w:sz w:val="17"/>
               </w:rPr>
-              <w:t>Presentation</w:t>
             </w:r>
           </w:p>
         </w:tc>
@@ -3263,14 +3334,15 @@
             <w:pPr>
               <w:spacing w:after="40"/>
             </w:pPr>
-            <w:r/>
+            <w:r>
+              <w:t>React, TypeScript, Vite, Tailwind CSS</w:t>
+            </w:r>
             <w:r>
               <w:rPr>
                 <w:rFonts w:ascii="Aptos" w:hAnsi="Aptos"/>
                 <w:b w:val="0"/>
                 <w:sz w:val="17"/>
               </w:rPr>
-              <w:t>React, TypeScript, Vite, Tailwind CSS</w:t>
             </w:r>
           </w:p>
         </w:tc>
@@ -3289,14 +3361,15 @@
             <w:pPr>
               <w:spacing w:after="40"/>
             </w:pPr>
-            <w:r/>
+            <w:r>
+              <w:t>Bengali-first responsive screens, transient workflow state, static demo area/facility content, Web Share/Clipboard, optional browser speech input, and PWA setup.</w:t>
+            </w:r>
             <w:r>
               <w:rPr>
                 <w:rFonts w:ascii="Aptos" w:hAnsi="Aptos"/>
                 <w:b w:val="0"/>
                 <w:sz w:val="17"/>
               </w:rPr>
-              <w:t>Bengali-first responsive screens, accessible controls, workflow state, Web Share/Clipboard integration, optional browser speech input, PWA manifest and service worker.</w:t>
             </w:r>
           </w:p>
         </w:tc>
@@ -3318,14 +3391,15 @@
             <w:pPr>
               <w:spacing w:after="40"/>
             </w:pPr>
-            <w:r/>
+            <w:r>
+              <w:t>API</w:t>
+            </w:r>
             <w:r>
               <w:rPr>
                 <w:rFonts w:ascii="Aptos" w:hAnsi="Aptos"/>
                 <w:b w:val="0"/>
                 <w:sz w:val="17"/>
               </w:rPr>
-              <w:t>API</w:t>
             </w:r>
           </w:p>
         </w:tc>
@@ -3345,14 +3419,15 @@
             <w:pPr>
               <w:spacing w:after="40"/>
             </w:pPr>
-            <w:r/>
+            <w:r>
+              <w:t>Java 21, Spring Boot 3, REST, Spring Security, Bean Validation</w:t>
+            </w:r>
             <w:r>
               <w:rPr>
                 <w:rFonts w:ascii="Aptos" w:hAnsi="Aptos"/>
                 <w:b w:val="0"/>
                 <w:sz w:val="17"/>
               </w:rPr>
-              <w:t>Java 21, Spring Boot 3, REST, Spring Security, Bean Validation</w:t>
             </w:r>
           </w:p>
         </w:tc>
@@ -3372,14 +3447,15 @@
             <w:pPr>
               <w:spacing w:after="40"/>
             </w:pPr>
-            <w:r/>
+            <w:r>
+              <w:t>Validate route/explanation requests, route evaluation, PostgreSQL retrieval, Ollama invocation, safety-policy fallback, CORS, and health endpoint.</w:t>
+            </w:r>
             <w:r>
               <w:rPr>
                 <w:rFonts w:ascii="Aptos" w:hAnsi="Aptos"/>
                 <w:b w:val="0"/>
                 <w:sz w:val="17"/>
               </w:rPr>
-              <w:t>Route evaluation, service lookup, AI-summary endpoint, feature flags, validation, rate limits, error contracts, audit events.</w:t>
             </w:r>
           </w:p>
         </w:tc>
@@ -3400,14 +3476,15 @@
             <w:pPr>
               <w:spacing w:after="40"/>
             </w:pPr>
-            <w:r/>
+            <w:r>
+              <w:t>Safety domain</w:t>
+            </w:r>
             <w:r>
               <w:rPr>
                 <w:rFonts w:ascii="Aptos" w:hAnsi="Aptos"/>
                 <w:b w:val="0"/>
                 <w:sz w:val="17"/>
               </w:rPr>
-              <w:t>Safety domain</w:t>
             </w:r>
           </w:p>
         </w:tc>
@@ -3426,14 +3503,15 @@
             <w:pPr>
               <w:spacing w:after="40"/>
             </w:pPr>
-            <w:r/>
+            <w:r>
+              <w:t>SafetyRoutingService plus deterministic Java fallback</w:t>
+            </w:r>
             <w:r>
               <w:rPr>
                 <w:rFonts w:ascii="Aptos" w:hAnsi="Aptos"/>
                 <w:b w:val="0"/>
                 <w:sz w:val="17"/>
               </w:rPr>
-              <w:t>Deterministic Java rules module</w:t>
             </w:r>
           </w:p>
         </w:tc>
@@ -3452,14 +3530,15 @@
             <w:pPr>
               <w:spacing w:after="40"/>
             </w:pPr>
-            <w:r/>
+            <w:r>
+              <w:t>Uses retrieved clinical criteria to fix URGENT, ROUTINE, or HUMAN_SUPPORT. UI detail, RAG content, and Ollama output cannot change it.</w:t>
+            </w:r>
             <w:r>
               <w:rPr>
                 <w:rFonts w:ascii="Aptos" w:hAnsi="Aptos"/>
                 <w:b w:val="0"/>
                 <w:sz w:val="17"/>
               </w:rPr>
-              <w:t>Maps fixed symptom and urgent-sign identifiers to urgent/routine/human result. Versioned and independently unit-tested.</w:t>
             </w:r>
           </w:p>
         </w:tc>
@@ -3481,14 +3560,15 @@
             <w:pPr>
               <w:spacing w:after="40"/>
             </w:pPr>
-            <w:r/>
+            <w:r>
+              <w:t>Persistence</w:t>
+            </w:r>
             <w:r>
               <w:rPr>
                 <w:rFonts w:ascii="Aptos" w:hAnsi="Aptos"/>
                 <w:b w:val="0"/>
                 <w:sz w:val="17"/>
               </w:rPr>
-              <w:t>Persistence</w:t>
             </w:r>
           </w:p>
         </w:tc>
@@ -3508,14 +3588,15 @@
             <w:pPr>
               <w:spacing w:after="40"/>
             </w:pPr>
-            <w:r/>
+            <w:r>
+              <w:t>PostgreSQL with JdbcTemplate; JPA ServiceLocation repository reserved</w:t>
+            </w:r>
             <w:r>
               <w:rPr>
                 <w:rFonts w:ascii="Aptos" w:hAnsi="Aptos"/>
                 <w:b w:val="0"/>
                 <w:sz w:val="17"/>
               </w:rPr>
-              <w:t>PostgreSQL, Spring Data JPA/Hibernate</w:t>
             </w:r>
           </w:p>
         </w:tc>
@@ -3535,14 +3616,15 @@
             <w:pPr>
               <w:spacing w:after="40"/>
             </w:pPr>
-            <w:r/>
+            <w:r>
+              <w:t>clinical_source, clinical_pathway, clinical_criterion, clinical_guidance, and clinical_pathway_source support demo routing and RAG. service_locations is not integrated into the live UI.</w:t>
+            </w:r>
             <w:r>
               <w:rPr>
                 <w:rFonts w:ascii="Aptos" w:hAnsi="Aptos"/>
                 <w:b w:val="0"/>
                 <w:sz w:val="17"/>
               </w:rPr>
-              <w:t>Facilities, locations, reviewed content, rules/version metadata, feature-flag defaults, non-identifying analytics/audit records.</w:t>
             </w:r>
           </w:p>
         </w:tc>
@@ -3563,14 +3645,15 @@
             <w:pPr>
               <w:spacing w:after="40"/>
             </w:pPr>
-            <w:r/>
+            <w:r>
+              <w:t>AI integration</w:t>
+            </w:r>
             <w:r>
               <w:rPr>
                 <w:rFonts w:ascii="Aptos" w:hAnsi="Aptos"/>
                 <w:b w:val="0"/>
                 <w:sz w:val="17"/>
               </w:rPr>
-              <w:t>AI integration</w:t>
             </w:r>
           </w:p>
         </w:tc>
@@ -3589,14 +3672,15 @@
             <w:pPr>
               <w:spacing w:after="40"/>
             </w:pPr>
-            <w:r/>
+            <w:r>
+              <w:t>Local Ollama REST /api/chat, called only from Java</w:t>
+            </w:r>
             <w:r>
               <w:rPr>
                 <w:rFonts w:ascii="Aptos" w:hAnsi="Aptos"/>
                 <w:b w:val="0"/>
                 <w:sz w:val="17"/>
               </w:rPr>
-              <w:t>OpenAI REST API called only from backend</w:t>
             </w:r>
           </w:p>
         </w:tc>
@@ -3615,14 +3699,15 @@
             <w:pPr>
               <w:spacing w:after="40"/>
             </w:pPr>
-            <w:r/>
+            <w:r>
+              <w:t>After route lock, retrieves route guidance from PostgreSQL, requests short Bengali explanation, validates it, or returns fixed safe fallback.</w:t>
+            </w:r>
             <w:r>
               <w:rPr>
                 <w:rFonts w:ascii="Aptos" w:hAnsi="Aptos"/>
                 <w:b w:val="0"/>
                 <w:sz w:val="17"/>
               </w:rPr>
-              <w:t>Optional Bengali caregiver summary only after a safe route exists; validates response against schema and falls back to approved Bengali content.</w:t>
             </w:r>
           </w:p>
         </w:tc>
@@ -3644,14 +3729,15 @@
             <w:pPr>
               <w:spacing w:after="40"/>
             </w:pPr>
-            <w:r/>
+            <w:r>
+              <w:t>Delivery</w:t>
+            </w:r>
             <w:r>
               <w:rPr>
                 <w:rFonts w:ascii="Aptos" w:hAnsi="Aptos"/>
                 <w:b w:val="0"/>
                 <w:sz w:val="17"/>
               </w:rPr>
-              <w:t>Delivery</w:t>
             </w:r>
           </w:p>
         </w:tc>
@@ -3671,14 +3757,15 @@
             <w:pPr>
               <w:spacing w:after="40"/>
             </w:pPr>
-            <w:r/>
+            <w:r>
+              <w:t>Docker Compose for PostgreSQL 16 and Ollama; local Spring Boot and Vite dev servers</w:t>
+            </w:r>
             <w:r>
               <w:rPr>
                 <w:rFonts w:ascii="Aptos" w:hAnsi="Aptos"/>
                 <w:b w:val="0"/>
                 <w:sz w:val="17"/>
               </w:rPr>
-              <w:t>Vercel/Netlify client; Render/Railway/AWS/Azure API + PostgreSQL</w:t>
             </w:r>
           </w:p>
         </w:tc>
@@ -3698,14 +3785,15 @@
             <w:pPr>
               <w:spacing w:after="40"/>
             </w:pPr>
-            <w:r/>
+            <w:r>
+              <w:t>Current capstone run mode. Managed TLS hosting, backups, deployment controls, and production observability are future release gates.</w:t>
+            </w:r>
             <w:r>
               <w:rPr>
                 <w:rFonts w:ascii="Aptos" w:hAnsi="Aptos"/>
                 <w:b w:val="0"/>
                 <w:sz w:val="17"/>
               </w:rPr>
-              <w:t>TLS, environment-specific configuration, logs, backups, health checks, and deployment controls.</w:t>
             </w:r>
           </w:p>
         </w:tc>
@@ -3739,7 +3827,7 @@
           <w:rFonts w:ascii="Aptos" w:hAnsi="Aptos"/>
           <w:sz w:val="20"/>
         </w:rPr>
-        <w:t>The browser sends only fixed symptom identifiers and warning-sign answers to the route API. The API returns a reviewed route code and approved content key.</w:t>
+        <w:t>The browser sends only fixed concern and optional history codes plus an explicit human-support request. The route API returns a deterministic route and rule version.</w:t>
       </w:r>
     </w:p>
     <w:p>
@@ -3752,7 +3840,7 @@
           <w:rFonts w:ascii="Aptos" w:hAnsi="Aptos"/>
           <w:sz w:val="20"/>
         </w:rPr>
-        <w:t>The client uses district and town/block only to request a service-direction result. Browser geolocation is requested only after the user selects the location action.</w:t>
+        <w:t>District and town/block selections are currently used in the browser to display static demo service-direction content; the live UI does not call a location or service API.</w:t>
       </w:r>
     </w:p>
     <w:p>
@@ -3765,7 +3853,7 @@
           <w:rFonts w:ascii="Aptos" w:hAnsi="Aptos"/>
           <w:sz w:val="20"/>
         </w:rPr>
-        <w:t>The caregiver-summary request is made only for a routine route, only when the “Enable AI summary” flag is true, and only through the Java backend. The OpenAI API key is never sent to the client.</w:t>
+        <w:t>The route-explanation request is optional, server-side only, and eligible after any fixed route. AI_SUMMARY_ENABLED and DEMO_RAG_ENABLED are evaluated by Java; Ollama is never called from the browser.</w:t>
       </w:r>
     </w:p>
     <w:p>
@@ -3778,7 +3866,7 @@
           <w:rFonts w:ascii="Aptos" w:hAnsi="Aptos"/>
           <w:sz w:val="20"/>
         </w:rPr>
-        <w:t>If AI is off, unavailable, times out, fails validation, or produces disallowed text, the backend returns the approved Bengali fallback. The user flow remains complete.</w:t>
+        <w:t>If Ollama is disabled, unavailable, times out, fails validation, or produces unsafe text, Java returns deterministic fallback guidance. The route and user journey remain complete.</w:t>
       </w:r>
     </w:p>
     <w:p>
@@ -4284,7 +4372,7 @@
           <w:color w:val="263D48"/>
           <w:sz w:val="20"/>
         </w:rPr>
-        <w:t>REST endpoints must use JSON, UTF-8, API versioning under /api/v1, validation errors with machine-readable codes, and a consistent error envelope. Endpoint names below are the target MVP contract; implementation may add internal fields without breaking documented client behavior.</w:t>
+        <w:t>The live REST API uses JSON and UTF-8 under /api/v1. It accepts allowlisted codes, performs Bean Validation, and returns standard Spring error responses. The table below documents the implemented contract; service-directory and client-feature APIs remain future work.</w:t>
       </w:r>
     </w:p>
     <w:tbl>
@@ -4319,7 +4407,9 @@
             <w:pPr>
               <w:spacing w:after="40"/>
             </w:pPr>
-            <w:r/>
+            <w:r>
+              <w:t>Method and path</w:t>
+            </w:r>
             <w:r>
               <w:rPr>
                 <w:rFonts w:ascii="Aptos" w:hAnsi="Aptos"/>
@@ -4327,7 +4417,6 @@
                 <w:color w:val="FFFFFF"/>
                 <w:sz w:val="17"/>
               </w:rPr>
-              <w:t>Method and path</w:t>
             </w:r>
           </w:p>
         </w:tc>
@@ -4347,7 +4436,9 @@
             <w:pPr>
               <w:spacing w:after="40"/>
             </w:pPr>
-            <w:r/>
+            <w:r>
+              <w:t>Purpose</w:t>
+            </w:r>
             <w:r>
               <w:rPr>
                 <w:rFonts w:ascii="Aptos" w:hAnsi="Aptos"/>
@@ -4355,7 +4446,6 @@
                 <w:color w:val="FFFFFF"/>
                 <w:sz w:val="17"/>
               </w:rPr>
-              <w:t>Purpose</w:t>
             </w:r>
           </w:p>
         </w:tc>
@@ -4375,7 +4465,9 @@
             <w:pPr>
               <w:spacing w:after="40"/>
             </w:pPr>
-            <w:r/>
+            <w:r>
+              <w:t>Implemented request / response</w:t>
+            </w:r>
             <w:r>
               <w:rPr>
                 <w:rFonts w:ascii="Aptos" w:hAnsi="Aptos"/>
@@ -4383,7 +4475,6 @@
                 <w:color w:val="FFFFFF"/>
                 <w:sz w:val="17"/>
               </w:rPr>
-              <w:t>Core request / response</w:t>
             </w:r>
           </w:p>
         </w:tc>
@@ -4404,14 +4495,15 @@
             <w:pPr>
               <w:spacing w:after="40"/>
             </w:pPr>
-            <w:r/>
+            <w:r>
+              <w:t>POST /api/v1/routing/evaluate</w:t>
+            </w:r>
             <w:r>
               <w:rPr>
                 <w:rFonts w:ascii="Aptos" w:hAnsi="Aptos"/>
                 <w:b w:val="0"/>
                 <w:sz w:val="17"/>
               </w:rPr>
-              <w:t>POST /api/v1/routing/evaluate</w:t>
             </w:r>
           </w:p>
         </w:tc>
@@ -4430,14 +4522,15 @@
             <w:pPr>
               <w:spacing w:after="40"/>
             </w:pPr>
-            <w:r/>
+            <w:r>
+              <w:t>Evaluate the deterministic safety route.</w:t>
+            </w:r>
             <w:r>
               <w:rPr>
                 <w:rFonts w:ascii="Aptos" w:hAnsi="Aptos"/>
                 <w:b w:val="0"/>
                 <w:sz w:val="17"/>
               </w:rPr>
-              <w:t>Evaluate deterministic reviewed safety route.</w:t>
             </w:r>
           </w:p>
         </w:tc>
@@ -4456,14 +4549,15 @@
             <w:pPr>
               <w:spacing w:after="40"/>
             </w:pPr>
-            <w:r/>
+            <w:r>
+              <w:t>Request: concerns[], history[], needsHumanSupport. Response: outcome (URGENT|ROUTINE|HUMAN_SUPPORT), ruleVersion. Unknown enum values are rejected by validation.</w:t>
+            </w:r>
             <w:r>
               <w:rPr>
                 <w:rFonts w:ascii="Aptos" w:hAnsi="Aptos"/>
                 <w:b w:val="0"/>
                 <w:sz w:val="17"/>
               </w:rPr>
-              <w:t>Request: symptomIds, urgentSignIds. Response: route (URGENT|ROUTINE|HUMAN_SUPPORT), ruleVersion, contentKey, reasons[]; no diagnosis.</w:t>
             </w:r>
           </w:p>
         </w:tc>
@@ -4485,14 +4579,15 @@
             <w:pPr>
               <w:spacing w:after="40"/>
             </w:pPr>
-            <w:r/>
+            <w:r>
+              <w:t>POST /api/v1/ai/route-explanation</w:t>
+            </w:r>
             <w:r>
               <w:rPr>
                 <w:rFonts w:ascii="Aptos" w:hAnsi="Aptos"/>
                 <w:b w:val="0"/>
                 <w:sz w:val="17"/>
               </w:rPr>
-              <w:t>GET /api/v1/locations/districts</w:t>
             </w:r>
           </w:p>
         </w:tc>
@@ -4512,14 +4607,15 @@
             <w:pPr>
               <w:spacing w:after="40"/>
             </w:pPr>
-            <w:r/>
+            <w:r>
+              <w:t>Return an optional safe Bengali explanation after route lock.</w:t>
+            </w:r>
             <w:r>
               <w:rPr>
                 <w:rFonts w:ascii="Aptos" w:hAnsi="Aptos"/>
                 <w:b w:val="0"/>
                 <w:sz w:val="17"/>
               </w:rPr>
-              <w:t>List supported demo districts.</w:t>
             </w:r>
           </w:p>
         </w:tc>
@@ -4539,14 +4635,15 @@
             <w:pPr>
               <w:spacing w:after="40"/>
             </w:pPr>
-            <w:r/>
+            <w:r>
+              <w:t>Request: outcome, concerns[], history[]. Response: summaryBn, source (OLLAMA_RAG_VALIDATED|SAFE_FIXED_FALLBACK), sources[].</w:t>
+            </w:r>
             <w:r>
               <w:rPr>
                 <w:rFonts w:ascii="Aptos" w:hAnsi="Aptos"/>
                 <w:b w:val="0"/>
                 <w:sz w:val="17"/>
               </w:rPr>
-              <w:t>Response: bilingual district id/name values.</w:t>
             </w:r>
           </w:p>
         </w:tc>
@@ -4567,14 +4664,15 @@
             <w:pPr>
               <w:spacing w:after="40"/>
             </w:pPr>
-            <w:r/>
+            <w:r>
+              <w:t>GET /actuator/health</w:t>
+            </w:r>
             <w:r>
               <w:rPr>
                 <w:rFonts w:ascii="Aptos" w:hAnsi="Aptos"/>
                 <w:b w:val="0"/>
                 <w:sz w:val="17"/>
               </w:rPr>
-              <w:t>GET /api/v1/locations/districts/{id}/areas</w:t>
             </w:r>
           </w:p>
         </w:tc>
@@ -4593,14 +4691,15 @@
             <w:pPr>
               <w:spacing w:after="40"/>
             </w:pPr>
-            <w:r/>
+            <w:r>
+              <w:t>Local health check.</w:t>
+            </w:r>
             <w:r>
               <w:rPr>
                 <w:rFonts w:ascii="Aptos" w:hAnsi="Aptos"/>
                 <w:b w:val="0"/>
                 <w:sz w:val="17"/>
               </w:rPr>
-              <w:t>List towns, cities, or blocks for a district.</w:t>
             </w:r>
           </w:p>
         </w:tc>
@@ -4619,14 +4718,15 @@
             <w:pPr>
               <w:spacing w:after="40"/>
             </w:pPr>
-            <w:r/>
+            <w:r>
+              <w:t>Actuator health response. The endpoint is public in the capstone configuration.</w:t>
+            </w:r>
             <w:r>
               <w:rPr>
                 <w:rFonts w:ascii="Aptos" w:hAnsi="Aptos"/>
                 <w:b w:val="0"/>
                 <w:sz w:val="17"/>
               </w:rPr>
-              <w:t>Response: bilingual area id/name values.</w:t>
             </w:r>
           </w:p>
         </w:tc>
@@ -4648,14 +4748,15 @@
             <w:pPr>
               <w:spacing w:after="40"/>
             </w:pPr>
-            <w:r/>
+            <w:r>
+              <w:t>Not implemented in live API</w:t>
+            </w:r>
             <w:r>
               <w:rPr>
                 <w:rFonts w:ascii="Aptos" w:hAnsi="Aptos"/>
                 <w:b w:val="0"/>
                 <w:sz w:val="17"/>
               </w:rPr>
-              <w:t>GET /api/v1/services</w:t>
             </w:r>
           </w:p>
         </w:tc>
@@ -4675,14 +4776,15 @@
             <w:pPr>
               <w:spacing w:after="40"/>
             </w:pPr>
-            <w:r/>
+            <w:r>
+              <w:t>Locations, service directory, client feature flags, caregiver-summary, administrative, and audit APIs.</w:t>
+            </w:r>
             <w:r>
               <w:rPr>
                 <w:rFonts w:ascii="Aptos" w:hAnsi="Aptos"/>
                 <w:b w:val="0"/>
                 <w:sz w:val="17"/>
               </w:rPr>
-              <w:t>Return approved care/support options.</w:t>
             </w:r>
           </w:p>
         </w:tc>
@@ -4702,257 +4804,15 @@
             <w:pPr>
               <w:spacing w:after="40"/>
             </w:pPr>
-            <w:r/>
+            <w:r>
+              <w:t>The current frontend uses static demo data for locations and facilities. These APIs remain pilot/production work.</w:t>
+            </w:r>
             <w:r>
               <w:rPr>
                 <w:rFonts w:ascii="Aptos" w:hAnsi="Aptos"/>
                 <w:b w:val="0"/>
                 <w:sz w:val="17"/>
               </w:rPr>
-              <w:t>Query: districtId, areaId, route, optional latitude/longitude. Response: service cards, contact, verifiedAt, demo flag.</w:t>
-            </w:r>
-          </w:p>
-        </w:tc>
-      </w:tr>
-      <w:tr>
-        <w:tc>
-          <w:tcPr>
-            <w:tcW w:type="dxa" w:w="2736"/>
-            <w:vAlign w:val="center"/>
-            <w:tcMar>
-              <w:top w:w="90" w:type="dxa"/>
-              <w:start w:w="110" w:type="dxa"/>
-              <w:bottom w:w="90" w:type="dxa"/>
-              <w:end w:w="110" w:type="dxa"/>
-            </w:tcMar>
-          </w:tcPr>
-          <w:p>
-            <w:pPr>
-              <w:spacing w:after="40"/>
-            </w:pPr>
-            <w:r/>
-            <w:r>
-              <w:rPr>
-                <w:rFonts w:ascii="Aptos" w:hAnsi="Aptos"/>
-                <w:b w:val="0"/>
-                <w:sz w:val="17"/>
-              </w:rPr>
-              <w:t>POST /api/v1/summaries/caregiver</w:t>
-            </w:r>
-          </w:p>
-        </w:tc>
-        <w:tc>
-          <w:tcPr>
-            <w:tcW w:type="dxa" w:w="2304"/>
-            <w:vAlign w:val="center"/>
-            <w:tcMar>
-              <w:top w:w="90" w:type="dxa"/>
-              <w:start w:w="110" w:type="dxa"/>
-              <w:bottom w:w="90" w:type="dxa"/>
-              <w:end w:w="110" w:type="dxa"/>
-            </w:tcMar>
-          </w:tcPr>
-          <w:p>
-            <w:pPr>
-              <w:spacing w:after="40"/>
-            </w:pPr>
-            <w:r/>
-            <w:r>
-              <w:rPr>
-                <w:rFonts w:ascii="Aptos" w:hAnsi="Aptos"/>
-                <w:b w:val="0"/>
-                <w:sz w:val="17"/>
-              </w:rPr>
-              <w:t>Return routine caregiver message.</w:t>
-            </w:r>
-          </w:p>
-        </w:tc>
-        <w:tc>
-          <w:tcPr>
-            <w:tcW w:type="dxa" w:w="4752"/>
-            <w:vAlign w:val="center"/>
-            <w:tcMar>
-              <w:top w:w="90" w:type="dxa"/>
-              <w:start w:w="110" w:type="dxa"/>
-              <w:bottom w:w="90" w:type="dxa"/>
-              <w:end w:w="110" w:type="dxa"/>
-            </w:tcMar>
-          </w:tcPr>
-          <w:p>
-            <w:pPr>
-              <w:spacing w:after="40"/>
-            </w:pPr>
-            <w:r/>
-            <w:r>
-              <w:rPr>
-                <w:rFonts w:ascii="Aptos" w:hAnsi="Aptos"/>
-                <w:b w:val="0"/>
-                <w:sz w:val="17"/>
-              </w:rPr>
-              <w:t>Request: safe route context, selected symptoms, optional consented patient detail. Response: approved or AI-generated summary, source, fallbackUsed.</w:t>
-            </w:r>
-          </w:p>
-        </w:tc>
-      </w:tr>
-      <w:tr>
-        <w:tc>
-          <w:tcPr>
-            <w:tcW w:type="dxa" w:w="2736"/>
-            <w:shd w:fill="F6FAF9"/>
-            <w:vAlign w:val="center"/>
-            <w:tcMar>
-              <w:top w:w="90" w:type="dxa"/>
-              <w:start w:w="110" w:type="dxa"/>
-              <w:bottom w:w="90" w:type="dxa"/>
-              <w:end w:w="110" w:type="dxa"/>
-            </w:tcMar>
-          </w:tcPr>
-          <w:p>
-            <w:pPr>
-              <w:spacing w:after="40"/>
-            </w:pPr>
-            <w:r/>
-            <w:r>
-              <w:rPr>
-                <w:rFonts w:ascii="Aptos" w:hAnsi="Aptos"/>
-                <w:b w:val="0"/>
-                <w:sz w:val="17"/>
-              </w:rPr>
-              <w:t>GET /api/v1/features</w:t>
-            </w:r>
-          </w:p>
-        </w:tc>
-        <w:tc>
-          <w:tcPr>
-            <w:tcW w:type="dxa" w:w="2304"/>
-            <w:shd w:fill="F6FAF9"/>
-            <w:vAlign w:val="center"/>
-            <w:tcMar>
-              <w:top w:w="90" w:type="dxa"/>
-              <w:start w:w="110" w:type="dxa"/>
-              <w:bottom w:w="90" w:type="dxa"/>
-              <w:end w:w="110" w:type="dxa"/>
-            </w:tcMar>
-          </w:tcPr>
-          <w:p>
-            <w:pPr>
-              <w:spacing w:after="40"/>
-            </w:pPr>
-            <w:r/>
-            <w:r>
-              <w:rPr>
-                <w:rFonts w:ascii="Aptos" w:hAnsi="Aptos"/>
-                <w:b w:val="0"/>
-                <w:sz w:val="17"/>
-              </w:rPr>
-              <w:t>Read client-safe feature flags.</w:t>
-            </w:r>
-          </w:p>
-        </w:tc>
-        <w:tc>
-          <w:tcPr>
-            <w:tcW w:type="dxa" w:w="4752"/>
-            <w:shd w:fill="F6FAF9"/>
-            <w:vAlign w:val="center"/>
-            <w:tcMar>
-              <w:top w:w="90" w:type="dxa"/>
-              <w:start w:w="110" w:type="dxa"/>
-              <w:bottom w:w="90" w:type="dxa"/>
-              <w:end w:w="110" w:type="dxa"/>
-            </w:tcMar>
-          </w:tcPr>
-          <w:p>
-            <w:pPr>
-              <w:spacing w:after="40"/>
-            </w:pPr>
-            <w:r/>
-            <w:r>
-              <w:rPr>
-                <w:rFonts w:ascii="Aptos" w:hAnsi="Aptos"/>
-                <w:b w:val="0"/>
-                <w:sz w:val="17"/>
-              </w:rPr>
-              <w:t>Response: enableAiSummary and other non-secret presentation flags.</w:t>
-            </w:r>
-          </w:p>
-        </w:tc>
-      </w:tr>
-      <w:tr>
-        <w:tc>
-          <w:tcPr>
-            <w:tcW w:type="dxa" w:w="2736"/>
-            <w:vAlign w:val="center"/>
-            <w:tcMar>
-              <w:top w:w="90" w:type="dxa"/>
-              <w:start w:w="110" w:type="dxa"/>
-              <w:bottom w:w="90" w:type="dxa"/>
-              <w:end w:w="110" w:type="dxa"/>
-            </w:tcMar>
-          </w:tcPr>
-          <w:p>
-            <w:pPr>
-              <w:spacing w:after="40"/>
-            </w:pPr>
-            <w:r/>
-            <w:r>
-              <w:rPr>
-                <w:rFonts w:ascii="Aptos" w:hAnsi="Aptos"/>
-                <w:b w:val="0"/>
-                <w:sz w:val="17"/>
-              </w:rPr>
-              <w:t>GET /actuator/health</w:t>
-            </w:r>
-          </w:p>
-        </w:tc>
-        <w:tc>
-          <w:tcPr>
-            <w:tcW w:type="dxa" w:w="2304"/>
-            <w:vAlign w:val="center"/>
-            <w:tcMar>
-              <w:top w:w="90" w:type="dxa"/>
-              <w:start w:w="110" w:type="dxa"/>
-              <w:bottom w:w="90" w:type="dxa"/>
-              <w:end w:w="110" w:type="dxa"/>
-            </w:tcMar>
-          </w:tcPr>
-          <w:p>
-            <w:pPr>
-              <w:spacing w:after="40"/>
-            </w:pPr>
-            <w:r/>
-            <w:r>
-              <w:rPr>
-                <w:rFonts w:ascii="Aptos" w:hAnsi="Aptos"/>
-                <w:b w:val="0"/>
-                <w:sz w:val="17"/>
-              </w:rPr>
-              <w:t>Platform liveness/readiness.</w:t>
-            </w:r>
-          </w:p>
-        </w:tc>
-        <w:tc>
-          <w:tcPr>
-            <w:tcW w:type="dxa" w:w="4752"/>
-            <w:vAlign w:val="center"/>
-            <w:tcMar>
-              <w:top w:w="90" w:type="dxa"/>
-              <w:start w:w="110" w:type="dxa"/>
-              <w:bottom w:w="90" w:type="dxa"/>
-              <w:end w:w="110" w:type="dxa"/>
-            </w:tcMar>
-          </w:tcPr>
-          <w:p>
-            <w:pPr>
-              <w:spacing w:after="40"/>
-            </w:pPr>
-            <w:r/>
-            <w:r>
-              <w:rPr>
-                <w:rFonts w:ascii="Aptos" w:hAnsi="Aptos"/>
-                <w:b w:val="0"/>
-                <w:sz w:val="17"/>
-              </w:rPr>
-              <w:t>No sensitive operational details exposed publicly.</w:t>
             </w:r>
           </w:p>
         </w:tc>
@@ -5055,7 +4915,9 @@
             <w:pPr>
               <w:spacing w:after="40"/>
             </w:pPr>
-            <w:r/>
+            <w:r>
+              <w:t>Field</w:t>
+            </w:r>
             <w:r>
               <w:rPr>
                 <w:rFonts w:ascii="Aptos" w:hAnsi="Aptos"/>
@@ -5063,7 +4925,6 @@
                 <w:color w:val="FFFFFF"/>
                 <w:sz w:val="17"/>
               </w:rPr>
-              <w:t>Field</w:t>
             </w:r>
           </w:p>
         </w:tc>
@@ -5083,7 +4944,9 @@
             <w:pPr>
               <w:spacing w:after="40"/>
             </w:pPr>
-            <w:r/>
+            <w:r>
+              <w:t>Live rules</w:t>
+            </w:r>
             <w:r>
               <w:rPr>
                 <w:rFonts w:ascii="Aptos" w:hAnsi="Aptos"/>
@@ -5091,7 +4954,6 @@
                 <w:color w:val="FFFFFF"/>
                 <w:sz w:val="17"/>
               </w:rPr>
-              <w:t>Rules</w:t>
             </w:r>
           </w:p>
         </w:tc>
@@ -5112,14 +4974,15 @@
             <w:pPr>
               <w:spacing w:after="40"/>
             </w:pPr>
-            <w:r/>
+            <w:r>
+              <w:t>concerns</w:t>
+            </w:r>
             <w:r>
               <w:rPr>
                 <w:rFonts w:ascii="Aptos" w:hAnsi="Aptos"/>
                 <w:b w:val="0"/>
                 <w:sz w:val="17"/>
               </w:rPr>
-              <w:t>symptomIds</w:t>
             </w:r>
           </w:p>
         </w:tc>
@@ -5138,14 +5001,15 @@
             <w:pPr>
               <w:spacing w:after="40"/>
             </w:pPr>
-            <w:r/>
+            <w:r>
+              <w:t>Array of approved Concern enums sent from fixed UI options. May be empty only for explicit human support / fallback journeys.</w:t>
+            </w:r>
             <w:r>
               <w:rPr>
                 <w:rFonts w:ascii="Aptos" w:hAnsi="Aptos"/>
                 <w:b w:val="0"/>
                 <w:sz w:val="17"/>
               </w:rPr>
-              <w:t>Array of approved catalogue IDs. At least one is required for normal progression.</w:t>
             </w:r>
           </w:p>
         </w:tc>
@@ -5167,14 +5031,15 @@
             <w:pPr>
               <w:spacing w:after="40"/>
             </w:pPr>
-            <w:r/>
+            <w:r>
+              <w:t>history</w:t>
+            </w:r>
             <w:r>
               <w:rPr>
                 <w:rFonts w:ascii="Aptos" w:hAnsi="Aptos"/>
                 <w:b w:val="0"/>
                 <w:sz w:val="17"/>
               </w:rPr>
-              <w:t>urgentSignIds</w:t>
             </w:r>
           </w:p>
         </w:tc>
@@ -5194,14 +5059,15 @@
             <w:pPr>
               <w:spacing w:after="40"/>
             </w:pPr>
-            <w:r/>
+            <w:r>
+              <w:t>Optional HistoryCode enums. Java includes them in PostgreSQL criterion lookup, but current demo seed data has no history criterion that changes the route.</w:t>
+            </w:r>
             <w:r>
               <w:rPr>
                 <w:rFonts w:ascii="Aptos" w:hAnsi="Aptos"/>
                 <w:b w:val="0"/>
                 <w:sz w:val="17"/>
               </w:rPr>
-              <w:t>Array of approved warning-sign IDs. The Java rules module evaluates only these identifiers.</w:t>
             </w:r>
           </w:p>
         </w:tc>
@@ -5222,14 +5088,15 @@
             <w:pPr>
               <w:spacing w:after="40"/>
             </w:pPr>
-            <w:r/>
+            <w:r>
+              <w:t>needsHumanSupport</w:t>
+            </w:r>
             <w:r>
               <w:rPr>
                 <w:rFonts w:ascii="Aptos" w:hAnsi="Aptos"/>
                 <w:b w:val="0"/>
                 <w:sz w:val="17"/>
               </w:rPr>
-              <w:t>route</w:t>
             </w:r>
           </w:p>
         </w:tc>
@@ -5248,14 +5115,15 @@
             <w:pPr>
               <w:spacing w:after="40"/>
             </w:pPr>
-            <w:r/>
+            <w:r>
+              <w:t>Explicit boolean request. A true value returns HUMAN_SUPPORT unless an urgent condition has precedence.</w:t>
+            </w:r>
             <w:r>
               <w:rPr>
                 <w:rFonts w:ascii="Aptos" w:hAnsi="Aptos"/>
                 <w:b w:val="0"/>
                 <w:sz w:val="17"/>
               </w:rPr>
-              <w:t>One of URGENT, ROUTINE, HUMAN_SUPPORT. Must be accompanied by ruleVersion and approved content key.</w:t>
             </w:r>
           </w:p>
         </w:tc>
@@ -5277,14 +5145,15 @@
             <w:pPr>
               <w:spacing w:after="40"/>
             </w:pPr>
-            <w:r/>
+            <w:r>
+              <w:t>outcome</w:t>
+            </w:r>
             <w:r>
               <w:rPr>
                 <w:rFonts w:ascii="Aptos" w:hAnsi="Aptos"/>
                 <w:b w:val="0"/>
                 <w:sz w:val="17"/>
               </w:rPr>
-              <w:t>districtId / areaId</w:t>
             </w:r>
           </w:p>
         </w:tc>
@@ -5304,14 +5173,15 @@
             <w:pPr>
               <w:spacing w:after="40"/>
             </w:pPr>
-            <w:r/>
+            <w:r>
+              <w:t>One of URGENT, ROUTINE, HUMAN_SUPPORT. It is fixed by Java before the route-explanation request.</w:t>
+            </w:r>
             <w:r>
               <w:rPr>
                 <w:rFonts w:ascii="Aptos" w:hAnsi="Aptos"/>
                 <w:b w:val="0"/>
                 <w:sz w:val="17"/>
               </w:rPr>
-              <w:t>Optional until service-direction stage; must be known catalogue IDs when supplied.</w:t>
             </w:r>
           </w:p>
         </w:tc>
@@ -5332,14 +5202,15 @@
             <w:pPr>
               <w:spacing w:after="40"/>
             </w:pPr>
-            <w:r/>
+            <w:r>
+              <w:t>route-explanation input</w:t>
+            </w:r>
             <w:r>
               <w:rPr>
                 <w:rFonts w:ascii="Aptos" w:hAnsi="Aptos"/>
                 <w:b w:val="0"/>
                 <w:sz w:val="17"/>
               </w:rPr>
-              <w:t>patient details</w:t>
             </w:r>
           </w:p>
         </w:tc>
@@ -5358,70 +5229,15 @@
             <w:pPr>
               <w:spacing w:after="40"/>
             </w:pPr>
-            <w:r/>
+            <w:r>
+              <w:t>Route plus fixed concern/history arrays only. Browser speech/transcript, patient details, location, and free text are not sent to Ollama.</w:t>
+            </w:r>
             <w:r>
               <w:rPr>
                 <w:rFonts w:ascii="Aptos" w:hAnsi="Aptos"/>
                 <w:b w:val="0"/>
                 <w:sz w:val="17"/>
               </w:rPr>
-              <w:t>Optional name, age, address, phone. Used only in a share-preview request after explicit consent. Do not log values or persist by default.</w:t>
-            </w:r>
-          </w:p>
-        </w:tc>
-      </w:tr>
-      <w:tr>
-        <w:tc>
-          <w:tcPr>
-            <w:tcW w:type="dxa" w:w="2736"/>
-            <w:shd w:fill="F6FAF9"/>
-            <w:vAlign w:val="center"/>
-            <w:tcMar>
-              <w:top w:w="90" w:type="dxa"/>
-              <w:start w:w="110" w:type="dxa"/>
-              <w:bottom w:w="90" w:type="dxa"/>
-              <w:end w:w="110" w:type="dxa"/>
-            </w:tcMar>
-          </w:tcPr>
-          <w:p>
-            <w:pPr>
-              <w:spacing w:after="40"/>
-            </w:pPr>
-            <w:r/>
-            <w:r>
-              <w:rPr>
-                <w:rFonts w:ascii="Aptos" w:hAnsi="Aptos"/>
-                <w:b w:val="0"/>
-                <w:sz w:val="17"/>
-              </w:rPr>
-              <w:t>ai summary input</w:t>
-            </w:r>
-          </w:p>
-        </w:tc>
-        <w:tc>
-          <w:tcPr>
-            <w:tcW w:type="dxa" w:w="7056"/>
-            <w:shd w:fill="F6FAF9"/>
-            <w:vAlign w:val="center"/>
-            <w:tcMar>
-              <w:top w:w="90" w:type="dxa"/>
-              <w:start w:w="110" w:type="dxa"/>
-              <w:bottom w:w="90" w:type="dxa"/>
-              <w:end w:w="110" w:type="dxa"/>
-            </w:tcMar>
-          </w:tcPr>
-          <w:p>
-            <w:pPr>
-              <w:spacing w:after="40"/>
-            </w:pPr>
-            <w:r/>
-            <w:r>
-              <w:rPr>
-                <w:rFonts w:ascii="Aptos" w:hAnsi="Aptos"/>
-                <w:b w:val="0"/>
-                <w:sz w:val="17"/>
-              </w:rPr>
-              <w:t>Routine route only. Must exclude raw audio and must be schema-limited before an external call.</w:t>
             </w:r>
           </w:p>
         </w:tc>
@@ -5477,7 +5293,9 @@
             <w:pPr>
               <w:spacing w:after="40"/>
             </w:pPr>
-            <w:r/>
+            <w:r>
+              <w:t>Live structure</w:t>
+            </w:r>
             <w:r>
               <w:rPr>
                 <w:rFonts w:ascii="Aptos" w:hAnsi="Aptos"/>
@@ -5485,7 +5303,6 @@
                 <w:color w:val="FFFFFF"/>
                 <w:sz w:val="17"/>
               </w:rPr>
-              <w:t>Entity</w:t>
             </w:r>
           </w:p>
         </w:tc>
@@ -5505,7 +5322,9 @@
             <w:pPr>
               <w:spacing w:after="40"/>
             </w:pPr>
-            <w:r/>
+            <w:r>
+              <w:t>Key fields / purpose</w:t>
+            </w:r>
             <w:r>
               <w:rPr>
                 <w:rFonts w:ascii="Aptos" w:hAnsi="Aptos"/>
@@ -5513,7 +5332,6 @@
                 <w:color w:val="FFFFFF"/>
                 <w:sz w:val="17"/>
               </w:rPr>
-              <w:t>Key fields</w:t>
             </w:r>
           </w:p>
         </w:tc>
@@ -5533,7 +5351,9 @@
             <w:pPr>
               <w:spacing w:after="40"/>
             </w:pPr>
-            <w:r/>
+            <w:r>
+              <w:t>Implementation note</w:t>
+            </w:r>
             <w:r>
               <w:rPr>
                 <w:rFonts w:ascii="Aptos" w:hAnsi="Aptos"/>
@@ -5541,7 +5361,6 @@
                 <w:color w:val="FFFFFF"/>
                 <w:sz w:val="17"/>
               </w:rPr>
-              <w:t>Notes</w:t>
             </w:r>
           </w:p>
         </w:tc>
@@ -5562,14 +5381,15 @@
             <w:pPr>
               <w:spacing w:after="40"/>
             </w:pPr>
-            <w:r/>
+            <w:r>
+              <w:t>clinical_source</w:t>
+            </w:r>
             <w:r>
               <w:rPr>
                 <w:rFonts w:ascii="Aptos" w:hAnsi="Aptos"/>
                 <w:b w:val="0"/>
                 <w:sz w:val="17"/>
               </w:rPr>
-              <w:t>SafetyRuleSet</w:t>
             </w:r>
           </w:p>
         </w:tc>
@@ -5588,14 +5408,15 @@
             <w:pPr>
               <w:spacing w:after="40"/>
             </w:pPr>
-            <w:r/>
+            <w:r>
+              <w:t>id, organization, title, url, accessed_on</w:t>
+            </w:r>
             <w:r>
               <w:rPr>
                 <w:rFonts w:ascii="Aptos" w:hAnsi="Aptos"/>
                 <w:b w:val="0"/>
                 <w:sz w:val="17"/>
               </w:rPr>
-              <w:t>id, version, activeFrom, activeTo, approvedBy, status</w:t>
             </w:r>
           </w:p>
         </w:tc>
@@ -5614,14 +5435,15 @@
             <w:pPr>
               <w:spacing w:after="40"/>
             </w:pPr>
-            <w:r/>
+            <w:r>
+              <w:t>Provenance records for demo clinical knowledge.</w:t>
+            </w:r>
             <w:r>
               <w:rPr>
                 <w:rFonts w:ascii="Aptos" w:hAnsi="Aptos"/>
                 <w:b w:val="0"/>
                 <w:sz w:val="17"/>
               </w:rPr>
-              <w:t>Immutable or versioned record. Exactly one active approved rule set per environment.</w:t>
             </w:r>
           </w:p>
         </w:tc>
@@ -5643,14 +5465,15 @@
             <w:pPr>
               <w:spacing w:after="40"/>
             </w:pPr>
-            <w:r/>
+            <w:r>
+              <w:t>clinical_pathway</w:t>
+            </w:r>
             <w:r>
               <w:rPr>
                 <w:rFonts w:ascii="Aptos" w:hAnsi="Aptos"/>
                 <w:b w:val="0"/>
                 <w:sz w:val="17"/>
               </w:rPr>
-              <w:t>SymptomCatalog</w:t>
             </w:r>
           </w:p>
         </w:tc>
@@ -5670,14 +5493,15 @@
             <w:pPr>
               <w:spacing w:after="40"/>
             </w:pPr>
-            <w:r/>
+            <w:r>
+              <w:t>id, route, status, title</w:t>
+            </w:r>
             <w:r>
               <w:rPr>
                 <w:rFonts w:ascii="Aptos" w:hAnsi="Aptos"/>
                 <w:b w:val="0"/>
                 <w:sz w:val="17"/>
               </w:rPr>
-              <w:t>id, bengaliLabel, englishLabel, category, active</w:t>
             </w:r>
           </w:p>
         </w:tc>
@@ -5697,14 +5521,15 @@
             <w:pPr>
               <w:spacing w:after="40"/>
             </w:pPr>
-            <w:r/>
+            <w:r>
+              <w:t>Defines the demo route pathway.</w:t>
+            </w:r>
             <w:r>
               <w:rPr>
                 <w:rFonts w:ascii="Aptos" w:hAnsi="Aptos"/>
                 <w:b w:val="0"/>
                 <w:sz w:val="17"/>
               </w:rPr>
-              <w:t>Fixed user-selectable options; labels owned by reviewed content process.</w:t>
             </w:r>
           </w:p>
         </w:tc>
@@ -5725,14 +5550,15 @@
             <w:pPr>
               <w:spacing w:after="40"/>
             </w:pPr>
-            <w:r/>
+            <w:r>
+              <w:t>clinical_criterion</w:t>
+            </w:r>
             <w:r>
               <w:rPr>
                 <w:rFonts w:ascii="Aptos" w:hAnsi="Aptos"/>
                 <w:b w:val="0"/>
                 <w:sz w:val="17"/>
               </w:rPr>
-              <w:t>UrgentSignCatalog</w:t>
             </w:r>
           </w:p>
         </w:tc>
@@ -5751,14 +5577,15 @@
             <w:pPr>
               <w:spacing w:after="40"/>
             </w:pPr>
-            <w:r/>
+            <w:r>
+              <w:t>pathway_id, criterion_type, input_code</w:t>
+            </w:r>
             <w:r>
               <w:rPr>
                 <w:rFonts w:ascii="Aptos" w:hAnsi="Aptos"/>
                 <w:b w:val="0"/>
                 <w:sz w:val="17"/>
               </w:rPr>
-              <w:t>id, bengaliLabel, englishLabel, active</w:t>
             </w:r>
           </w:p>
         </w:tc>
@@ -5777,14 +5604,15 @@
             <w:pPr>
               <w:spacing w:after="40"/>
             </w:pPr>
-            <w:r/>
+            <w:r>
+              <w:t>Routing criteria: URGENT_IF_ANY, ROUTINE_IF_ANY, and ESCALATE_IF_ANY.</w:t>
+            </w:r>
             <w:r>
               <w:rPr>
                 <w:rFonts w:ascii="Aptos" w:hAnsi="Aptos"/>
                 <w:b w:val="0"/>
                 <w:sz w:val="17"/>
               </w:rPr>
-              <w:t>Fixed answers consumed by deterministic routing.</w:t>
             </w:r>
           </w:p>
         </w:tc>
@@ -5806,14 +5634,15 @@
             <w:pPr>
               <w:spacing w:after="40"/>
             </w:pPr>
-            <w:r/>
+            <w:r>
+              <w:t>clinical_guidance</w:t>
+            </w:r>
             <w:r>
               <w:rPr>
                 <w:rFonts w:ascii="Aptos" w:hAnsi="Aptos"/>
                 <w:b w:val="0"/>
                 <w:sz w:val="17"/>
               </w:rPr>
-              <w:t>ServiceLocation</w:t>
             </w:r>
           </w:p>
         </w:tc>
@@ -5833,14 +5662,15 @@
             <w:pPr>
               <w:spacing w:after="40"/>
             </w:pPr>
-            <w:r/>
+            <w:r>
+              <w:t>pathway_id, language, content</w:t>
+            </w:r>
             <w:r>
               <w:rPr>
                 <w:rFonts w:ascii="Aptos" w:hAnsi="Aptos"/>
                 <w:b w:val="0"/>
                 <w:sz w:val="17"/>
               </w:rPr>
-              <w:t>id, type, districtId, areaId, name, address, phone, verifiedAt, active, demo</w:t>
             </w:r>
           </w:p>
         </w:tc>
@@ -5860,14 +5690,15 @@
             <w:pPr>
               <w:spacing w:after="40"/>
             </w:pPr>
-            <w:r/>
+            <w:r>
+              <w:t>Bengali/English guidance retrieved after route lock for RAG context.</w:t>
+            </w:r>
             <w:r>
               <w:rPr>
                 <w:rFonts w:ascii="Aptos" w:hAnsi="Aptos"/>
                 <w:b w:val="0"/>
                 <w:sz w:val="17"/>
               </w:rPr>
-              <w:t>Vision centre, eye clinic, hospital, PHC, ASHA contact/support directory.</w:t>
             </w:r>
           </w:p>
         </w:tc>
@@ -5888,14 +5719,15 @@
             <w:pPr>
               <w:spacing w:after="40"/>
             </w:pPr>
-            <w:r/>
+            <w:r>
+              <w:t>clinical_pathway_source</w:t>
+            </w:r>
             <w:r>
               <w:rPr>
                 <w:rFonts w:ascii="Aptos" w:hAnsi="Aptos"/>
                 <w:b w:val="0"/>
                 <w:sz w:val="17"/>
               </w:rPr>
-              <w:t>ApprovedContent</w:t>
             </w:r>
           </w:p>
         </w:tc>
@@ -5914,14 +5746,15 @@
             <w:pPr>
               <w:spacing w:after="40"/>
             </w:pPr>
-            <w:r/>
+            <w:r>
+              <w:t>pathway_id, source_id</w:t>
+            </w:r>
             <w:r>
               <w:rPr>
                 <w:rFonts w:ascii="Aptos" w:hAnsi="Aptos"/>
                 <w:b w:val="0"/>
                 <w:sz w:val="17"/>
               </w:rPr>
-              <w:t>key, locale, route, body, version, approvedBy, active</w:t>
             </w:r>
           </w:p>
         </w:tc>
@@ -5940,14 +5773,15 @@
             <w:pPr>
               <w:spacing w:after="40"/>
             </w:pPr>
-            <w:r/>
+            <w:r>
+              <w:t>Links pathway to the displayed reference source.</w:t>
+            </w:r>
             <w:r>
               <w:rPr>
                 <w:rFonts w:ascii="Aptos" w:hAnsi="Aptos"/>
                 <w:b w:val="0"/>
                 <w:sz w:val="17"/>
               </w:rPr>
-              <w:t>Fallback messages and safety copy. Store Bengali and English separately.</w:t>
             </w:r>
           </w:p>
         </w:tc>
@@ -5969,14 +5803,15 @@
             <w:pPr>
               <w:spacing w:after="40"/>
             </w:pPr>
-            <w:r/>
+            <w:r>
+              <w:t>service_locations</w:t>
+            </w:r>
             <w:r>
               <w:rPr>
                 <w:rFonts w:ascii="Aptos" w:hAnsi="Aptos"/>
                 <w:b w:val="0"/>
                 <w:sz w:val="17"/>
               </w:rPr>
-              <w:t>FeatureFlag</w:t>
             </w:r>
           </w:p>
         </w:tc>
@@ -5996,14 +5831,15 @@
             <w:pPr>
               <w:spacing w:after="40"/>
             </w:pPr>
-            <w:r/>
+            <w:r>
+              <w:t>JPA entity/repository placeholder</w:t>
+            </w:r>
             <w:r>
               <w:rPr>
                 <w:rFonts w:ascii="Aptos" w:hAnsi="Aptos"/>
                 <w:b w:val="0"/>
                 <w:sz w:val="17"/>
               </w:rPr>
-              <w:t>key, enabled, environment, updatedAt, updatedBy</w:t>
             </w:r>
           </w:p>
         </w:tc>
@@ -6023,14 +5859,15 @@
             <w:pPr>
               <w:spacing w:after="40"/>
             </w:pPr>
-            <w:r/>
+            <w:r>
+              <w:t>Present in the schema/codebase but not queried by the current frontend workflow.</w:t>
+            </w:r>
             <w:r>
               <w:rPr>
                 <w:rFonts w:ascii="Aptos" w:hAnsi="Aptos"/>
                 <w:b w:val="0"/>
                 <w:sz w:val="17"/>
               </w:rPr>
-              <w:t>Includes ENABLE_AI_SUMMARY. Default false in production until approval.</w:t>
             </w:r>
           </w:p>
         </w:tc>
@@ -6051,14 +5888,15 @@
             <w:pPr>
               <w:spacing w:after="40"/>
             </w:pPr>
-            <w:r/>
+            <w:r>
+              <w:t>No current tables</w:t>
+            </w:r>
             <w:r>
               <w:rPr>
                 <w:rFonts w:ascii="Aptos" w:hAnsi="Aptos"/>
                 <w:b w:val="0"/>
                 <w:sz w:val="17"/>
               </w:rPr>
-              <w:t>AuditEvent</w:t>
             </w:r>
           </w:p>
         </w:tc>
@@ -6077,14 +5915,15 @@
             <w:pPr>
               <w:spacing w:after="40"/>
             </w:pPr>
-            <w:r/>
+            <w:r>
+              <w:t>Feature flags, patient records, audit events, AI request audit, or analytics events</w:t>
+            </w:r>
             <w:r>
               <w:rPr>
                 <w:rFonts w:ascii="Aptos" w:hAnsi="Aptos"/>
                 <w:b w:val="0"/>
                 <w:sz w:val="17"/>
               </w:rPr>
-              <w:t>eventType, route, ruleVersion, contentVersion, timestamp, correlationId</w:t>
             </w:r>
           </w:p>
         </w:tc>
@@ -6103,97 +5942,15 @@
             <w:pPr>
               <w:spacing w:after="40"/>
             </w:pPr>
-            <w:r/>
+            <w:r>
+              <w:t>Flags are environment/configuration properties. Do not represent these future controls as implemented.</w:t>
+            </w:r>
             <w:r>
               <w:rPr>
                 <w:rFonts w:ascii="Aptos" w:hAnsi="Aptos"/>
                 <w:b w:val="0"/>
                 <w:sz w:val="17"/>
               </w:rPr>
-              <w:t>No patient identifiers or raw free-text. Supports safety traceability.</w:t>
-            </w:r>
-          </w:p>
-        </w:tc>
-      </w:tr>
-      <w:tr>
-        <w:tc>
-          <w:tcPr>
-            <w:tcW w:type="dxa" w:w="2232"/>
-            <w:shd w:fill="F6FAF9"/>
-            <w:vAlign w:val="center"/>
-            <w:tcMar>
-              <w:top w:w="90" w:type="dxa"/>
-              <w:start w:w="110" w:type="dxa"/>
-              <w:bottom w:w="90" w:type="dxa"/>
-              <w:end w:w="110" w:type="dxa"/>
-            </w:tcMar>
-          </w:tcPr>
-          <w:p>
-            <w:pPr>
-              <w:spacing w:after="40"/>
-            </w:pPr>
-            <w:r/>
-            <w:r>
-              <w:rPr>
-                <w:rFonts w:ascii="Aptos" w:hAnsi="Aptos"/>
-                <w:b w:val="0"/>
-                <w:sz w:val="17"/>
-              </w:rPr>
-              <w:t>SummaryRequestAudit</w:t>
-            </w:r>
-          </w:p>
-        </w:tc>
-        <w:tc>
-          <w:tcPr>
-            <w:tcW w:type="dxa" w:w="3816"/>
-            <w:shd w:fill="F6FAF9"/>
-            <w:vAlign w:val="center"/>
-            <w:tcMar>
-              <w:top w:w="90" w:type="dxa"/>
-              <w:start w:w="110" w:type="dxa"/>
-              <w:bottom w:w="90" w:type="dxa"/>
-              <w:end w:w="110" w:type="dxa"/>
-            </w:tcMar>
-          </w:tcPr>
-          <w:p>
-            <w:pPr>
-              <w:spacing w:after="40"/>
-            </w:pPr>
-            <w:r/>
-            <w:r>
-              <w:rPr>
-                <w:rFonts w:ascii="Aptos" w:hAnsi="Aptos"/>
-                <w:b w:val="0"/>
-                <w:sz w:val="17"/>
-              </w:rPr>
-              <w:t>source, fallbackUsed, validationStatus, latencyMs, timestamp</w:t>
-            </w:r>
-          </w:p>
-        </w:tc>
-        <w:tc>
-          <w:tcPr>
-            <w:tcW w:type="dxa" w:w="3744"/>
-            <w:shd w:fill="F6FAF9"/>
-            <w:vAlign w:val="center"/>
-            <w:tcMar>
-              <w:top w:w="90" w:type="dxa"/>
-              <w:start w:w="110" w:type="dxa"/>
-              <w:bottom w:w="90" w:type="dxa"/>
-              <w:end w:w="110" w:type="dxa"/>
-            </w:tcMar>
-          </w:tcPr>
-          <w:p>
-            <w:pPr>
-              <w:spacing w:after="40"/>
-            </w:pPr>
-            <w:r/>
-            <w:r>
-              <w:rPr>
-                <w:rFonts w:ascii="Aptos" w:hAnsi="Aptos"/>
-                <w:b w:val="0"/>
-                <w:sz w:val="17"/>
-              </w:rPr>
-              <w:t>No sensitive prompt or response text by default; keep technical metadata only.</w:t>
             </w:r>
           </w:p>
         </w:tc>
@@ -6232,7 +5989,7 @@
           <w:color w:val="263D48"/>
           <w:sz w:val="20"/>
         </w:rPr>
-        <w:t>Controlled AI is an enhancement, not a routing mechanism. Its only MVP purpose is to produce a short, supportive Bengali caregiver summary after a routine route has already been determined by reviewed rules. The application must remain useful when the feature flag is off.</w:t>
+        <w:t>Controlled AI is an optional explanation layer, not a routing mechanism. In the live MVP, local Ollama can produce a short Bengali explanation after Java has determined any route. Java safety policy accepts safe content or returns a fixed fallback.</w:t>
       </w:r>
     </w:p>
     <w:p>
@@ -6279,7 +6036,9 @@
             <w:pPr>
               <w:spacing w:after="40"/>
             </w:pPr>
-            <w:r/>
+            <w:r>
+              <w:t>Step</w:t>
+            </w:r>
             <w:r>
               <w:rPr>
                 <w:rFonts w:ascii="Aptos" w:hAnsi="Aptos"/>
@@ -6287,7 +6046,6 @@
                 <w:color w:val="FFFFFF"/>
                 <w:sz w:val="17"/>
               </w:rPr>
-              <w:t>Step</w:t>
             </w:r>
           </w:p>
         </w:tc>
@@ -6307,7 +6065,9 @@
             <w:pPr>
               <w:spacing w:after="40"/>
             </w:pPr>
-            <w:r/>
+            <w:r>
+              <w:t>Implemented behavior</w:t>
+            </w:r>
             <w:r>
               <w:rPr>
                 <w:rFonts w:ascii="Aptos" w:hAnsi="Aptos"/>
@@ -6315,7 +6075,6 @@
                 <w:color w:val="FFFFFF"/>
                 <w:sz w:val="17"/>
               </w:rPr>
-              <w:t>Required behavior</w:t>
             </w:r>
           </w:p>
         </w:tc>
@@ -6336,14 +6095,15 @@
             <w:pPr>
               <w:spacing w:after="40"/>
             </w:pPr>
-            <w:r/>
+            <w:r>
+              <w:t>1. Route first</w:t>
+            </w:r>
             <w:r>
               <w:rPr>
                 <w:rFonts w:ascii="Aptos" w:hAnsi="Aptos"/>
                 <w:b w:val="0"/>
                 <w:sz w:val="17"/>
               </w:rPr>
-              <w:t>1. Route first</w:t>
             </w:r>
           </w:p>
         </w:tc>
@@ -6362,14 +6122,15 @@
             <w:pPr>
               <w:spacing w:after="40"/>
             </w:pPr>
-            <w:r/>
+            <w:r>
+              <w:t>Java runs SafetyRoutingService and fixes the route using UI codes plus matching PostgreSQL criteria. Ollama is called only afterwards.</w:t>
+            </w:r>
             <w:r>
               <w:rPr>
                 <w:rFonts w:ascii="Aptos" w:hAnsi="Aptos"/>
                 <w:b w:val="0"/>
                 <w:sz w:val="17"/>
               </w:rPr>
-              <w:t>Call deterministic routing endpoint and accept only ROUTINE route for AI summary eligibility.</w:t>
             </w:r>
           </w:p>
         </w:tc>
@@ -6391,14 +6152,15 @@
             <w:pPr>
               <w:spacing w:after="40"/>
             </w:pPr>
-            <w:r/>
+            <w:r>
+              <w:t>2. Check configuration</w:t>
+            </w:r>
             <w:r>
               <w:rPr>
                 <w:rFonts w:ascii="Aptos" w:hAnsi="Aptos"/>
                 <w:b w:val="0"/>
                 <w:sz w:val="17"/>
               </w:rPr>
-              <w:t>2. Check flag</w:t>
             </w:r>
           </w:p>
         </w:tc>
@@ -6418,14 +6180,15 @@
             <w:pPr>
               <w:spacing w:after="40"/>
             </w:pPr>
-            <w:r/>
+            <w:r>
+              <w:t>AI_SUMMARY_ENABLED and DEMO_RAG_ENABLED are read server-side. If disabled, Java returns safe fixed fallback content.</w:t>
+            </w:r>
             <w:r>
               <w:rPr>
                 <w:rFonts w:ascii="Aptos" w:hAnsi="Aptos"/>
                 <w:b w:val="0"/>
                 <w:sz w:val="17"/>
               </w:rPr>
-              <w:t>Read ENABLE_AI_SUMMARY server-side. If false, return approved Bengali fallback immediately.</w:t>
             </w:r>
           </w:p>
         </w:tc>
@@ -6446,14 +6209,15 @@
             <w:pPr>
               <w:spacing w:after="40"/>
             </w:pPr>
-            <w:r/>
+            <w:r>
+              <w:t>3. Retrieve RAG context</w:t>
+            </w:r>
             <w:r>
               <w:rPr>
                 <w:rFonts w:ascii="Aptos" w:hAnsi="Aptos"/>
                 <w:b w:val="0"/>
                 <w:sz w:val="17"/>
               </w:rPr>
-              <w:t>3. Minimise input</w:t>
             </w:r>
           </w:p>
         </w:tc>
@@ -6472,14 +6236,15 @@
             <w:pPr>
               <w:spacing w:after="40"/>
             </w:pPr>
-            <w:r/>
+            <w:r>
+              <w:t>ApprovedClinicalKnowledgeRepository retrieves route-specific guidance and source records from PostgreSQL. Retrieval cannot alter the route.</w:t>
+            </w:r>
             <w:r>
               <w:rPr>
                 <w:rFonts w:ascii="Aptos" w:hAnsi="Aptos"/>
                 <w:b w:val="0"/>
                 <w:sz w:val="17"/>
               </w:rPr>
-              <w:t>Send only allowlisted context: route, selected catalogue labels, approved next step, and optionally consented share fields. Never include raw audio.</w:t>
             </w:r>
           </w:p>
         </w:tc>
@@ -6501,14 +6266,15 @@
             <w:pPr>
               <w:spacing w:after="40"/>
             </w:pPr>
-            <w:r/>
+            <w:r>
+              <w:t>4. Generate</w:t>
+            </w:r>
             <w:r>
               <w:rPr>
                 <w:rFonts w:ascii="Aptos" w:hAnsi="Aptos"/>
                 <w:b w:val="0"/>
                 <w:sz w:val="17"/>
               </w:rPr>
-              <w:t>4. Generate</w:t>
             </w:r>
           </w:p>
         </w:tc>
@@ -6528,14 +6294,15 @@
             <w:pPr>
               <w:spacing w:after="40"/>
             </w:pPr>
-            <w:r/>
+            <w:r>
+              <w:t>Java calls local Ollama /api/chat using OLLAMA_BASE_URL and OLLAMA_MODEL (default llama3.2:3b), with short Bengali output instructions.</w:t>
+            </w:r>
             <w:r>
               <w:rPr>
                 <w:rFonts w:ascii="Aptos" w:hAnsi="Aptos"/>
                 <w:b w:val="0"/>
                 <w:sz w:val="17"/>
               </w:rPr>
-              <w:t>Backend invokes OpenAI with a constrained system instruction and structured output request. API key stays in server environment variables.</w:t>
             </w:r>
           </w:p>
         </w:tc>
@@ -6556,14 +6323,15 @@
             <w:pPr>
               <w:spacing w:after="40"/>
             </w:pPr>
-            <w:r/>
+            <w:r>
+              <w:t>5. Validate</w:t>
+            </w:r>
             <w:r>
               <w:rPr>
                 <w:rFonts w:ascii="Aptos" w:hAnsi="Aptos"/>
                 <w:b w:val="0"/>
                 <w:sz w:val="17"/>
               </w:rPr>
-              <w:t>5. Validate</w:t>
             </w:r>
           </w:p>
         </w:tc>
@@ -6582,14 +6350,15 @@
             <w:pPr>
               <w:spacing w:after="40"/>
             </w:pPr>
-            <w:r/>
+            <w:r>
+              <w:t>CaregiverSummaryPolicy validates the output for safe, route-consistent Bengali wording and rejects unsafe/unusable text.</w:t>
+            </w:r>
             <w:r>
               <w:rPr>
                 <w:rFonts w:ascii="Aptos" w:hAnsi="Aptos"/>
                 <w:b w:val="0"/>
                 <w:sz w:val="17"/>
               </w:rPr>
-              <w:t>Check language, max length, schema, prohibited diagnosis/treatment claims, unchanged safety instruction, and no invented facility details.</w:t>
             </w:r>
           </w:p>
         </w:tc>
@@ -6611,14 +6380,15 @@
             <w:pPr>
               <w:spacing w:after="40"/>
             </w:pPr>
-            <w:r/>
+            <w:r>
+              <w:t>6. Fallback</w:t>
+            </w:r>
             <w:r>
               <w:rPr>
                 <w:rFonts w:ascii="Aptos" w:hAnsi="Aptos"/>
                 <w:b w:val="0"/>
                 <w:sz w:val="17"/>
               </w:rPr>
-              <w:t>6. Fallback</w:t>
             </w:r>
           </w:p>
         </w:tc>
@@ -6638,14 +6408,15 @@
             <w:pPr>
               <w:spacing w:after="40"/>
             </w:pPr>
-            <w:r/>
+            <w:r>
+              <w:t>Connection/read timeout, API error, empty/malformed response, disabled feature, or safety rejection returns SAFE_FIXED_FALLBACK.</w:t>
+            </w:r>
             <w:r>
               <w:rPr>
                 <w:rFonts w:ascii="Aptos" w:hAnsi="Aptos"/>
                 <w:b w:val="0"/>
                 <w:sz w:val="17"/>
               </w:rPr>
-              <w:t>If timeout, API error, malformed output, safety rejection, or rate limit occurs, return approved content with fallbackUsed=true.</w:t>
             </w:r>
           </w:p>
         </w:tc>
@@ -6666,14 +6437,15 @@
             <w:pPr>
               <w:spacing w:after="40"/>
             </w:pPr>
-            <w:r/>
+            <w:r>
+              <w:t>7. Present</w:t>
+            </w:r>
             <w:r>
               <w:rPr>
                 <w:rFonts w:ascii="Aptos" w:hAnsi="Aptos"/>
                 <w:b w:val="0"/>
                 <w:sz w:val="17"/>
               </w:rPr>
-              <w:t>7. Present</w:t>
             </w:r>
           </w:p>
         </w:tc>
@@ -6692,14 +6464,15 @@
             <w:pPr>
               <w:spacing w:after="40"/>
             </w:pPr>
-            <w:r/>
+            <w:r>
+              <w:t>The result UI shows guidance based on approved information, source attribution, the selected route/concerns, and route actions. Result-page audio is intentionally absent.</w:t>
+            </w:r>
             <w:r>
               <w:rPr>
                 <w:rFonts w:ascii="Aptos" w:hAnsi="Aptos"/>
                 <w:b w:val="0"/>
                 <w:sz w:val="17"/>
               </w:rPr>
-              <w:t>Client labels the result as a family/caregiver summary and keeps share/copy optional. It must not imply medical diagnosis or replace care guidance.</w:t>
             </w:r>
           </w:p>
         </w:tc>
@@ -6733,7 +6506,7 @@
           <w:rFonts w:ascii="Aptos" w:hAnsi="Aptos"/>
           <w:sz w:val="20"/>
         </w:rPr>
-        <w:t>Prompt instruction: do not diagnose, name a disease, prescribe medicine, change urgency, or claim a clinician has reviewed the user.</w:t>
+        <w:t>Prompt and policy: do not diagnose, name a disease, prescribe medicine, change urgency, invent facilities, or claim a clinician reviewed the user.</w:t>
       </w:r>
     </w:p>
     <w:p>
@@ -6746,7 +6519,7 @@
           <w:rFonts w:ascii="Aptos" w:hAnsi="Aptos"/>
           <w:sz w:val="20"/>
         </w:rPr>
-        <w:t>Use structured JSON output with fields such as bengaliSummary, englishSummary, safetyNoticeRetained, and validationStatus; reject any unexpected fields.</w:t>
+        <w:t>The live call requests short Bengali text rather than requiring structured JSON. Defensive parsing accepts text or a summary field, then Java policy validation determines acceptance.</w:t>
       </w:r>
     </w:p>
     <w:p>
@@ -6759,7 +6532,7 @@
           <w:rFonts w:ascii="Aptos" w:hAnsi="Aptos"/>
           <w:sz w:val="20"/>
         </w:rPr>
-        <w:t>Post-generation policy validation must reject prohibited diagnostic terms and medical instructions, enforce approved action phrases, and cap output length.</w:t>
+        <w:t>Post-generation policy validation enforces Bengali text, a short length, prohibited diagnosis/treatment terms, and route-consistent safe language.</w:t>
       </w:r>
     </w:p>
     <w:p>
@@ -6772,7 +6545,7 @@
           <w:rFonts w:ascii="Aptos" w:hAnsi="Aptos"/>
           <w:sz w:val="20"/>
         </w:rPr>
-        <w:t>Apply request timeout, retry only safe idempotent calls, per-user/IP rate limiting, and circuit-breaker behavior. Fallback content must be local and immediately available.</w:t>
+        <w:t>Implemented resilience is an explicit connection/read timeout and deterministic Java fallback. Retry, circuit breaker, and rate limiting are pilot release gates, not current behavior.</w:t>
       </w:r>
     </w:p>
     <w:p>
@@ -6785,7 +6558,7 @@
           <w:rFonts w:ascii="Aptos" w:hAnsi="Aptos"/>
           <w:sz w:val="20"/>
         </w:rPr>
-        <w:t>Log only metadata needed for reliability and review. Do not log OPENAI_API_KEY, raw patient data, full prompts, or full model output by default.</w:t>
+        <w:t>The demo logs technical routing data, including selected codes and matched criteria. Before any pilot, logs must be reduced to non-content metadata and reviewed under a privacy policy.</w:t>
       </w:r>
     </w:p>
     <w:tbl>
@@ -6880,7 +6653,9 @@
             <w:pPr>
               <w:spacing w:after="40"/>
             </w:pPr>
-            <w:r/>
+            <w:r>
+              <w:t>Control area</w:t>
+            </w:r>
             <w:r>
               <w:rPr>
                 <w:rFonts w:ascii="Aptos" w:hAnsi="Aptos"/>
@@ -6888,7 +6663,6 @@
                 <w:color w:val="FFFFFF"/>
                 <w:sz w:val="17"/>
               </w:rPr>
-              <w:t>Control area</w:t>
             </w:r>
           </w:p>
         </w:tc>
@@ -6908,7 +6682,9 @@
             <w:pPr>
               <w:spacing w:after="40"/>
             </w:pPr>
-            <w:r/>
+            <w:r>
+              <w:t>Current implementation and release gap</w:t>
+            </w:r>
             <w:r>
               <w:rPr>
                 <w:rFonts w:ascii="Aptos" w:hAnsi="Aptos"/>
@@ -6916,7 +6692,6 @@
                 <w:color w:val="FFFFFF"/>
                 <w:sz w:val="17"/>
               </w:rPr>
-              <w:t>MVP requirement</w:t>
             </w:r>
           </w:p>
         </w:tc>
@@ -6937,14 +6712,15 @@
             <w:pPr>
               <w:spacing w:after="40"/>
             </w:pPr>
-            <w:r/>
+            <w:r>
+              <w:t>Secrets</w:t>
+            </w:r>
             <w:r>
               <w:rPr>
                 <w:rFonts w:ascii="Aptos" w:hAnsi="Aptos"/>
                 <w:b w:val="0"/>
                 <w:sz w:val="17"/>
               </w:rPr>
-              <w:t>Secrets</w:t>
             </w:r>
           </w:p>
         </w:tc>
@@ -6963,14 +6739,15 @@
             <w:pPr>
               <w:spacing w:after="40"/>
             </w:pPr>
-            <w:r/>
+            <w:r>
+              <w:t>Database credentials, CORS origin, Ollama configuration, and AI/RAG flags are environment variables. No OpenAI key exists in the live implementation.</w:t>
+            </w:r>
             <w:r>
               <w:rPr>
                 <w:rFonts w:ascii="Aptos" w:hAnsi="Aptos"/>
                 <w:b w:val="0"/>
                 <w:sz w:val="17"/>
               </w:rPr>
-              <w:t>OPENAI_API_KEY, database credentials, and CORS origins live in environment variables/secret manager only. Never commit .env files or expose keys in JavaScript bundles.</w:t>
             </w:r>
           </w:p>
         </w:tc>
@@ -6992,14 +6769,15 @@
             <w:pPr>
               <w:spacing w:after="40"/>
             </w:pPr>
-            <w:r/>
+            <w:r>
+              <w:t>Transport</w:t>
+            </w:r>
             <w:r>
               <w:rPr>
                 <w:rFonts w:ascii="Aptos" w:hAnsi="Aptos"/>
                 <w:b w:val="0"/>
                 <w:sz w:val="17"/>
               </w:rPr>
-              <w:t>Transport</w:t>
             </w:r>
           </w:p>
         </w:tc>
@@ -7019,14 +6797,15 @@
             <w:pPr>
               <w:spacing w:after="40"/>
             </w:pPr>
-            <w:r/>
+            <w:r>
+              <w:t>Local development uses HTTP. HTTPS, secure headers, and hardened deployment configuration are production release gates.</w:t>
+            </w:r>
             <w:r>
               <w:rPr>
                 <w:rFonts w:ascii="Aptos" w:hAnsi="Aptos"/>
                 <w:b w:val="0"/>
                 <w:sz w:val="17"/>
               </w:rPr>
-              <w:t>HTTPS in every deployed environment; secure headers; strict CORS allowlist for known frontend origins.</w:t>
             </w:r>
           </w:p>
         </w:tc>
@@ -7047,14 +6826,15 @@
             <w:pPr>
               <w:spacing w:after="40"/>
             </w:pPr>
-            <w:r/>
+            <w:r>
+              <w:t>Authentication</w:t>
+            </w:r>
             <w:r>
               <w:rPr>
                 <w:rFonts w:ascii="Aptos" w:hAnsi="Aptos"/>
                 <w:b w:val="0"/>
                 <w:sz w:val="17"/>
               </w:rPr>
-              <w:t>Authentication</w:t>
             </w:r>
           </w:p>
         </w:tc>
@@ -7073,14 +6853,15 @@
             <w:pPr>
               <w:spacing w:after="40"/>
             </w:pPr>
-            <w:r/>
+            <w:r>
+              <w:t>Routing, AI explanation, and health endpoints are public in the demo. Admin roles and protected content/service updates are not implemented.</w:t>
+            </w:r>
             <w:r>
               <w:rPr>
                 <w:rFonts w:ascii="Aptos" w:hAnsi="Aptos"/>
                 <w:b w:val="0"/>
                 <w:sz w:val="17"/>
               </w:rPr>
-              <w:t>Public user routes can be anonymous with rate limiting. Administrative updates (service data, rules, content, flags) require authenticated, role-based access.</w:t>
             </w:r>
           </w:p>
         </w:tc>
@@ -7102,14 +6883,15 @@
             <w:pPr>
               <w:spacing w:after="40"/>
             </w:pPr>
-            <w:r/>
+            <w:r>
+              <w:t>Patient details</w:t>
+            </w:r>
             <w:r>
               <w:rPr>
                 <w:rFonts w:ascii="Aptos" w:hAnsi="Aptos"/>
                 <w:b w:val="0"/>
                 <w:sz w:val="17"/>
               </w:rPr>
-              <w:t>Patient details</w:t>
             </w:r>
           </w:p>
         </w:tc>
@@ -7129,14 +6911,15 @@
             <w:pPr>
               <w:spacing w:after="40"/>
             </w:pPr>
-            <w:r/>
+            <w:r>
+              <w:t>The current workflow does not persist patient records. Keep name, age, address, phone, audio, and raw free text out of backend requests and logs.</w:t>
+            </w:r>
             <w:r>
               <w:rPr>
                 <w:rFonts w:ascii="Aptos" w:hAnsi="Aptos"/>
                 <w:b w:val="0"/>
                 <w:sz w:val="17"/>
               </w:rPr>
-              <w:t>Keep client-side until consented sharing. Explain local-use purpose. Do not persist or analytics-track name, age, address, phone, audio, or raw free-text in MVP.</w:t>
             </w:r>
           </w:p>
         </w:tc>
@@ -7157,14 +6940,15 @@
             <w:pPr>
               <w:spacing w:after="40"/>
             </w:pPr>
-            <w:r/>
+            <w:r>
+              <w:t>Location</w:t>
+            </w:r>
             <w:r>
               <w:rPr>
                 <w:rFonts w:ascii="Aptos" w:hAnsi="Aptos"/>
                 <w:b w:val="0"/>
                 <w:sz w:val="17"/>
               </w:rPr>
-              <w:t>Location</w:t>
             </w:r>
           </w:p>
         </w:tc>
@@ -7183,14 +6967,15 @@
             <w:pPr>
               <w:spacing w:after="40"/>
             </w:pPr>
-            <w:r/>
+            <w:r>
+              <w:t>The UI uses selected district/town/block and static demo cards. Browser geolocation and live directory integration are not live capabilities.</w:t>
+            </w:r>
             <w:r>
               <w:rPr>
                 <w:rFonts w:ascii="Aptos" w:hAnsi="Aptos"/>
                 <w:b w:val="0"/>
                 <w:sz w:val="17"/>
               </w:rPr>
-              <w:t>Request browser location only after explicit action. Provide district/town/block alternative. Do not silently retain coordinates.</w:t>
             </w:r>
           </w:p>
         </w:tc>
@@ -7212,14 +6997,15 @@
             <w:pPr>
               <w:spacing w:after="40"/>
             </w:pPr>
-            <w:r/>
+            <w:r>
+              <w:t>Content governance</w:t>
+            </w:r>
             <w:r>
               <w:rPr>
                 <w:rFonts w:ascii="Aptos" w:hAnsi="Aptos"/>
                 <w:b w:val="0"/>
                 <w:sz w:val="17"/>
               </w:rPr>
-              <w:t>Content governance</w:t>
             </w:r>
           </w:p>
         </w:tc>
@@ -7239,14 +7025,15 @@
             <w:pPr>
               <w:spacing w:after="40"/>
             </w:pPr>
-            <w:r/>
+            <w:r>
+              <w:t>Database records carry pathway/source relationships, but current content is demo-simulated and not clinically approved. Formal approval/version workflow is a pilot gate.</w:t>
+            </w:r>
             <w:r>
               <w:rPr>
                 <w:rFonts w:ascii="Aptos" w:hAnsi="Aptos"/>
                 <w:b w:val="0"/>
                 <w:sz w:val="17"/>
               </w:rPr>
-              <w:t>Rules, urgent copy, service entries, and fallback messages require version, approval owner, and reviewed-at metadata.</w:t>
             </w:r>
           </w:p>
         </w:tc>
@@ -7267,14 +7054,15 @@
             <w:pPr>
               <w:spacing w:after="40"/>
             </w:pPr>
-            <w:r/>
+            <w:r>
+              <w:t>Auditability</w:t>
+            </w:r>
             <w:r>
               <w:rPr>
                 <w:rFonts w:ascii="Aptos" w:hAnsi="Aptos"/>
                 <w:b w:val="0"/>
                 <w:sz w:val="17"/>
               </w:rPr>
-              <w:t>Auditability</w:t>
             </w:r>
           </w:p>
         </w:tc>
@@ -7293,14 +7081,15 @@
             <w:pPr>
               <w:spacing w:after="40"/>
             </w:pPr>
-            <w:r/>
+            <w:r>
+              <w:t>Current logs include routing codes and matched criteria. Before pilot, reduce to non-content metadata, define retention, and add governed audit records.</w:t>
+            </w:r>
             <w:r>
               <w:rPr>
                 <w:rFonts w:ascii="Aptos" w:hAnsi="Aptos"/>
                 <w:b w:val="0"/>
                 <w:sz w:val="17"/>
               </w:rPr>
-              <w:t>Store route code, rule/content version, feature-flag state, and technical outcome without user identifiers.</w:t>
             </w:r>
           </w:p>
         </w:tc>
@@ -7360,7 +7149,9 @@
             <w:pPr>
               <w:spacing w:after="40"/>
             </w:pPr>
-            <w:r/>
+            <w:r>
+              <w:t>Category</w:t>
+            </w:r>
             <w:r>
               <w:rPr>
                 <w:rFonts w:ascii="Aptos" w:hAnsi="Aptos"/>
@@ -7368,7 +7159,6 @@
                 <w:color w:val="FFFFFF"/>
                 <w:sz w:val="17"/>
               </w:rPr>
-              <w:t>Category</w:t>
             </w:r>
           </w:p>
         </w:tc>
@@ -7388,7 +7178,9 @@
             <w:pPr>
               <w:spacing w:after="40"/>
             </w:pPr>
-            <w:r/>
+            <w:r>
+              <w:t>Current state / release gate</w:t>
+            </w:r>
             <w:r>
               <w:rPr>
                 <w:rFonts w:ascii="Aptos" w:hAnsi="Aptos"/>
@@ -7396,7 +7188,6 @@
                 <w:color w:val="FFFFFF"/>
                 <w:sz w:val="17"/>
               </w:rPr>
-              <w:t>Target / requirement</w:t>
             </w:r>
           </w:p>
         </w:tc>
@@ -7417,14 +7208,15 @@
             <w:pPr>
               <w:spacing w:after="40"/>
             </w:pPr>
-            <w:r/>
+            <w:r>
+              <w:t>Availability</w:t>
+            </w:r>
             <w:r>
               <w:rPr>
                 <w:rFonts w:ascii="Aptos" w:hAnsi="Aptos"/>
                 <w:b w:val="0"/>
                 <w:sz w:val="17"/>
               </w:rPr>
-              <w:t>Availability</w:t>
             </w:r>
           </w:p>
         </w:tc>
@@ -7443,14 +7235,15 @@
             <w:pPr>
               <w:spacing w:after="40"/>
             </w:pPr>
-            <w:r/>
+            <w:r>
+              <w:t>Core routing and fixed fallback do not require Ollama. PostgreSQL is required for the current criteria/guidance implementation.</w:t>
+            </w:r>
             <w:r>
               <w:rPr>
                 <w:rFonts w:ascii="Aptos" w:hAnsi="Aptos"/>
                 <w:b w:val="0"/>
                 <w:sz w:val="17"/>
               </w:rPr>
-              <w:t>Core deterministic routing and approved fallback operate without dependency on OpenAI. Degraded mode must keep all critical guidance available.</w:t>
             </w:r>
           </w:p>
         </w:tc>
@@ -7472,14 +7265,15 @@
             <w:pPr>
               <w:spacing w:after="40"/>
             </w:pPr>
-            <w:r/>
+            <w:r>
+              <w:t>Performance</w:t>
+            </w:r>
             <w:r>
               <w:rPr>
                 <w:rFonts w:ascii="Aptos" w:hAnsi="Aptos"/>
                 <w:b w:val="0"/>
                 <w:sz w:val="17"/>
               </w:rPr>
-              <w:t>Performance</w:t>
             </w:r>
           </w:p>
         </w:tc>
@@ -7499,14 +7293,15 @@
             <w:pPr>
               <w:spacing w:after="40"/>
             </w:pPr>
-            <w:r/>
+            <w:r>
+              <w:t>Routing is local database lookup; Ollama connection timeout is 10 seconds and read timeout 75 seconds. A &lt;=10-second explanation-or-fallback target is a pilot gate.</w:t>
+            </w:r>
             <w:r>
               <w:rPr>
                 <w:rFonts w:ascii="Aptos" w:hAnsi="Aptos"/>
                 <w:b w:val="0"/>
                 <w:sz w:val="17"/>
               </w:rPr>
-              <w:t>p95 routing API &lt; 500 ms excluding network; service lookup p95 &lt; 750 ms; AI summary has explicit timeout and non-blocking fallback.</w:t>
             </w:r>
           </w:p>
         </w:tc>
@@ -7527,14 +7322,15 @@
             <w:pPr>
               <w:spacing w:after="40"/>
             </w:pPr>
-            <w:r/>
+            <w:r>
+              <w:t>Reliability</w:t>
+            </w:r>
             <w:r>
               <w:rPr>
                 <w:rFonts w:ascii="Aptos" w:hAnsi="Aptos"/>
                 <w:b w:val="0"/>
                 <w:sz w:val="17"/>
               </w:rPr>
-              <w:t>Reliability</w:t>
             </w:r>
           </w:p>
         </w:tc>
@@ -7553,14 +7349,15 @@
             <w:pPr>
               <w:spacing w:after="40"/>
             </w:pPr>
-            <w:r/>
+            <w:r>
+              <w:t>Browser workflow retains journey state during navigation and exposes back/return/restart controls. Refresh/close clears state.</w:t>
+            </w:r>
             <w:r>
               <w:rPr>
                 <w:rFonts w:ascii="Aptos" w:hAnsi="Aptos"/>
                 <w:b w:val="0"/>
                 <w:sz w:val="17"/>
               </w:rPr>
-              <w:t>No state transition may lose selected symptoms before a result; all critical screens offer a path back, return to result, or restart.</w:t>
             </w:r>
           </w:p>
         </w:tc>
@@ -7582,14 +7379,15 @@
             <w:pPr>
               <w:spacing w:after="40"/>
             </w:pPr>
-            <w:r/>
+            <w:r>
+              <w:t>Mobile usability</w:t>
+            </w:r>
             <w:r>
               <w:rPr>
                 <w:rFonts w:ascii="Aptos" w:hAnsi="Aptos"/>
                 <w:b w:val="0"/>
                 <w:sz w:val="17"/>
               </w:rPr>
-              <w:t>Mobile usability</w:t>
             </w:r>
           </w:p>
         </w:tc>
@@ -7609,14 +7407,15 @@
             <w:pPr>
               <w:spacing w:after="40"/>
             </w:pPr>
-            <w:r/>
+            <w:r>
+              <w:t>Responsive, Bengali-first UI with consistent controls. Formal device/accessibility acceptance testing remains a release gate.</w:t>
+            </w:r>
             <w:r>
               <w:rPr>
                 <w:rFonts w:ascii="Aptos" w:hAnsi="Aptos"/>
                 <w:b w:val="0"/>
                 <w:sz w:val="17"/>
               </w:rPr>
-              <w:t>Functional from 320 px width upward; primary actions reachable with thumb-friendly controls; no hover-only interaction.</w:t>
             </w:r>
           </w:p>
         </w:tc>
@@ -7637,14 +7436,15 @@
             <w:pPr>
               <w:spacing w:after="40"/>
             </w:pPr>
-            <w:r/>
+            <w:r>
+              <w:t>Accessibility</w:t>
+            </w:r>
             <w:r>
               <w:rPr>
                 <w:rFonts w:ascii="Aptos" w:hAnsi="Aptos"/>
                 <w:b w:val="0"/>
                 <w:sz w:val="17"/>
               </w:rPr>
-              <w:t>Accessibility</w:t>
             </w:r>
           </w:p>
         </w:tc>
@@ -7663,14 +7463,15 @@
             <w:pPr>
               <w:spacing w:after="40"/>
             </w:pPr>
-            <w:r/>
+            <w:r>
+              <w:t>Large selectable controls and bilingual hierarchy are implemented. WCAG 2.1 AA audit and screen-reader test evidence are pending.</w:t>
+            </w:r>
             <w:r>
               <w:rPr>
                 <w:rFonts w:ascii="Aptos" w:hAnsi="Aptos"/>
                 <w:b w:val="0"/>
                 <w:sz w:val="17"/>
               </w:rPr>
-              <w:t>WCAG 2.1 AA intent: colour contrast, text resize, focus handling, labels, error messaging, and touch target sizing.</w:t>
             </w:r>
           </w:p>
         </w:tc>
@@ -7692,14 +7493,15 @@
             <w:pPr>
               <w:spacing w:after="40"/>
             </w:pPr>
-            <w:r/>
+            <w:r>
+              <w:t>Observability</w:t>
+            </w:r>
             <w:r>
               <w:rPr>
                 <w:rFonts w:ascii="Aptos" w:hAnsi="Aptos"/>
                 <w:b w:val="0"/>
                 <w:sz w:val="17"/>
               </w:rPr>
-              <w:t>Observability</w:t>
             </w:r>
           </w:p>
         </w:tc>
@@ -7719,14 +7521,15 @@
             <w:pPr>
               <w:spacing w:after="40"/>
             </w:pPr>
-            <w:r/>
+            <w:r>
+              <w:t>Spring logs and Actuator health are available. Correlation IDs, dashboards, AI latency metrics, and privacy-safe audit telemetry are pending.</w:t>
+            </w:r>
             <w:r>
               <w:rPr>
                 <w:rFonts w:ascii="Aptos" w:hAnsi="Aptos"/>
                 <w:b w:val="0"/>
                 <w:sz w:val="17"/>
               </w:rPr>
-              <w:t>Correlation IDs, structured logs, health checks, route distribution, rule version usage, facility lookup errors, AI fallback rate, and API latency dashboards.</w:t>
             </w:r>
           </w:p>
         </w:tc>
@@ -7747,14 +7550,15 @@
             <w:pPr>
               <w:spacing w:after="40"/>
             </w:pPr>
-            <w:r/>
+            <w:r>
+              <w:t>Maintainability</w:t>
+            </w:r>
             <w:r>
               <w:rPr>
                 <w:rFonts w:ascii="Aptos" w:hAnsi="Aptos"/>
                 <w:b w:val="0"/>
                 <w:sz w:val="17"/>
               </w:rPr>
-              <w:t>Maintainability</w:t>
             </w:r>
           </w:p>
         </w:tc>
@@ -7773,14 +7577,15 @@
             <w:pPr>
               <w:spacing w:after="40"/>
             </w:pPr>
-            <w:r/>
+            <w:r>
+              <w:t>Typed frontend models and Java enums/services exist. No DB migration tool, linting evidence, integration suite, or e2e suite is currently established.</w:t>
+            </w:r>
             <w:r>
               <w:rPr>
                 <w:rFonts w:ascii="Aptos" w:hAnsi="Aptos"/>
                 <w:b w:val="0"/>
                 <w:sz w:val="17"/>
               </w:rPr>
-              <w:t>Typed contracts; centrally defined labels/content keys; linting; unit, integration, and end-to-end tests; conventional environment configuration.</w:t>
             </w:r>
           </w:p>
         </w:tc>
@@ -7802,14 +7607,15 @@
             <w:pPr>
               <w:spacing w:after="40"/>
             </w:pPr>
-            <w:r/>
+            <w:r>
+              <w:t>Data retention</w:t>
+            </w:r>
             <w:r>
               <w:rPr>
                 <w:rFonts w:ascii="Aptos" w:hAnsi="Aptos"/>
                 <w:b w:val="0"/>
                 <w:sz w:val="17"/>
               </w:rPr>
-              <w:t>Data retention</w:t>
             </w:r>
           </w:p>
         </w:tc>
@@ -7829,14 +7635,15 @@
             <w:pPr>
               <w:spacing w:after="40"/>
             </w:pPr>
-            <w:r/>
+            <w:r>
+              <w:t>No persistent patient data is designed for the demo. A formal retention/deletion policy is required before any future data collection.</w:t>
+            </w:r>
             <w:r>
               <w:rPr>
                 <w:rFonts w:ascii="Aptos" w:hAnsi="Aptos"/>
                 <w:b w:val="0"/>
                 <w:sz w:val="17"/>
               </w:rPr>
-              <w:t>No persistent patient data in MVP. Define explicit retention and deletion policy before any future collection.</w:t>
             </w:r>
           </w:p>
         </w:tc>
@@ -7891,7 +7698,9 @@
             <w:pPr>
               <w:spacing w:after="40"/>
             </w:pPr>
-            <w:r/>
+            <w:r>
+              <w:t>Test level</w:t>
+            </w:r>
             <w:r>
               <w:rPr>
                 <w:rFonts w:ascii="Aptos" w:hAnsi="Aptos"/>
@@ -7899,7 +7708,6 @@
                 <w:color w:val="FFFFFF"/>
                 <w:sz w:val="17"/>
               </w:rPr>
-              <w:t>Test level</w:t>
             </w:r>
           </w:p>
         </w:tc>
@@ -7919,7 +7727,9 @@
             <w:pPr>
               <w:spacing w:after="40"/>
             </w:pPr>
-            <w:r/>
+            <w:r>
+              <w:t>Current coverage / gap</w:t>
+            </w:r>
             <w:r>
               <w:rPr>
                 <w:rFonts w:ascii="Aptos" w:hAnsi="Aptos"/>
@@ -7927,7 +7737,6 @@
                 <w:color w:val="FFFFFF"/>
                 <w:sz w:val="17"/>
               </w:rPr>
-              <w:t>Coverage</w:t>
             </w:r>
           </w:p>
         </w:tc>
@@ -7948,14 +7757,15 @@
             <w:pPr>
               <w:spacing w:after="40"/>
             </w:pPr>
-            <w:r/>
+            <w:r>
+              <w:t>Java unit tests</w:t>
+            </w:r>
             <w:r>
               <w:rPr>
                 <w:rFonts w:ascii="Aptos" w:hAnsi="Aptos"/>
                 <w:b w:val="0"/>
                 <w:sz w:val="17"/>
               </w:rPr>
-              <w:t>Java unit tests: JUnit 5 + Mockito</w:t>
             </w:r>
           </w:p>
         </w:tc>
@@ -7974,14 +7784,15 @@
             <w:pPr>
               <w:spacing w:after="40"/>
             </w:pPr>
-            <w:r/>
+            <w:r>
+              <w:t>SafetyRoutingServiceTest covers deterministic precedence/routing and CaregiverSummaryPolicyTest covers acceptance/fallback policy.</w:t>
+            </w:r>
             <w:r>
               <w:rPr>
                 <w:rFonts w:ascii="Aptos" w:hAnsi="Aptos"/>
                 <w:b w:val="0"/>
                 <w:sz w:val="17"/>
               </w:rPr>
-              <w:t>Every rule combination; precedence of urgent signs; invalid IDs; content-key selection; feature flag branching; AI validator and fallback.</w:t>
             </w:r>
           </w:p>
         </w:tc>
@@ -8003,14 +7814,15 @@
             <w:pPr>
               <w:spacing w:after="40"/>
             </w:pPr>
-            <w:r/>
+            <w:r>
+              <w:t>Spring integration tests</w:t>
+            </w:r>
             <w:r>
               <w:rPr>
                 <w:rFonts w:ascii="Aptos" w:hAnsi="Aptos"/>
                 <w:b w:val="0"/>
                 <w:sz w:val="17"/>
               </w:rPr>
-              <w:t>Spring integration tests</w:t>
             </w:r>
           </w:p>
         </w:tc>
@@ -8030,14 +7842,15 @@
             <w:pPr>
               <w:spacing w:after="40"/>
             </w:pPr>
-            <w:r/>
+            <w:r>
+              <w:t>Not currently present. Add PostgreSQL repository, endpoint validation, CORS, health, and fallback integration coverage before pilot.</w:t>
+            </w:r>
             <w:r>
               <w:rPr>
                 <w:rFonts w:ascii="Aptos" w:hAnsi="Aptos"/>
                 <w:b w:val="0"/>
                 <w:sz w:val="17"/>
               </w:rPr>
-              <w:t>REST validation/error envelope, PostgreSQL repositories, authorised administration, CORS configuration, service filtering, and actuator health.</w:t>
             </w:r>
           </w:p>
         </w:tc>
@@ -8058,14 +7871,15 @@
             <w:pPr>
               <w:spacing w:after="40"/>
             </w:pPr>
-            <w:r/>
+            <w:r>
+              <w:t>Frontend tests</w:t>
+            </w:r>
             <w:r>
               <w:rPr>
                 <w:rFonts w:ascii="Aptos" w:hAnsi="Aptos"/>
                 <w:b w:val="0"/>
                 <w:sz w:val="17"/>
               </w:rPr>
-              <w:t>React Testing Library</w:t>
             </w:r>
           </w:p>
         </w:tc>
@@ -8084,14 +7898,15 @@
             <w:pPr>
               <w:spacing w:after="40"/>
             </w:pPr>
-            <w:r/>
+            <w:r>
+              <w:t>No React/Vitest test suite is currently present. Dependencies do not constitute executed coverage.</w:t>
+            </w:r>
             <w:r>
               <w:rPr>
                 <w:rFonts w:ascii="Aptos" w:hAnsi="Aptos"/>
                 <w:b w:val="0"/>
                 <w:sz w:val="17"/>
               </w:rPr>
-              <w:t>Consent enablement, option selection, bilingual labels, back/restart behavior, screen transitions, sharing status, and fallback presentation.</w:t>
             </w:r>
           </w:p>
         </w:tc>
@@ -8113,14 +7928,15 @@
             <w:pPr>
               <w:spacing w:after="40"/>
             </w:pPr>
-            <w:r/>
+            <w:r>
+              <w:t>End-to-end journeys</w:t>
+            </w:r>
             <w:r>
               <w:rPr>
                 <w:rFonts w:ascii="Aptos" w:hAnsi="Aptos"/>
                 <w:b w:val="0"/>
                 <w:sz w:val="17"/>
               </w:rPr>
-              <w:t>Playwright journeys</w:t>
             </w:r>
           </w:p>
         </w:tc>
@@ -8140,14 +7956,15 @@
             <w:pPr>
               <w:spacing w:after="40"/>
             </w:pPr>
-            <w:r/>
+            <w:r>
+              <w:t>No Playwright/Cypress suite is currently present. Manually verify urgent, routine, human support, back/restart, and fallback journeys for demo.</w:t>
+            </w:r>
             <w:r>
               <w:rPr>
                 <w:rFonts w:ascii="Aptos" w:hAnsi="Aptos"/>
                 <w:b w:val="0"/>
                 <w:sz w:val="17"/>
               </w:rPr>
-              <w:t>Urgent full path 5A–5A.6; routine 5B–6–7–8; human 5C–5C.2; no-location alternative; AI on/off/error behavior; mobile viewport.</w:t>
             </w:r>
           </w:p>
         </w:tc>
@@ -8168,14 +7985,15 @@
             <w:pPr>
               <w:spacing w:after="40"/>
             </w:pPr>
-            <w:r/>
+            <w:r>
+              <w:t>Manual content review</w:t>
+            </w:r>
             <w:r>
               <w:rPr>
                 <w:rFonts w:ascii="Aptos" w:hAnsi="Aptos"/>
                 <w:b w:val="0"/>
                 <w:sz w:val="17"/>
               </w:rPr>
-              <w:t>Manual content review</w:t>
             </w:r>
           </w:p>
         </w:tc>
@@ -8194,14 +8012,15 @@
             <w:pPr>
               <w:spacing w:after="40"/>
             </w:pPr>
-            <w:r/>
+            <w:r>
+              <w:t>Required before pilot because displayed guidance and sources are currently demo-simulated, not clinically approved.</w:t>
+            </w:r>
             <w:r>
               <w:rPr>
                 <w:rFonts w:ascii="Aptos" w:hAnsi="Aptos"/>
                 <w:b w:val="0"/>
                 <w:sz w:val="17"/>
               </w:rPr>
-              <w:t>Bengali naturalness, English secondary readability, no overlapping UI, content governance, service-data disclaimer, and non-diagnosis boundary.</w:t>
             </w:r>
           </w:p>
         </w:tc>
@@ -8223,14 +8042,15 @@
             <w:pPr>
               <w:spacing w:after="40"/>
             </w:pPr>
-            <w:r/>
+            <w:r>
+              <w:t>Security checks</w:t>
+            </w:r>
             <w:r>
               <w:rPr>
                 <w:rFonts w:ascii="Aptos" w:hAnsi="Aptos"/>
                 <w:b w:val="0"/>
                 <w:sz w:val="17"/>
               </w:rPr>
-              <w:t>Security checks</w:t>
             </w:r>
           </w:p>
         </w:tc>
@@ -8250,14 +8070,15 @@
             <w:pPr>
               <w:spacing w:after="40"/>
             </w:pPr>
-            <w:r/>
+            <w:r>
+              <w:t>Secret scan, dependency remediation, CORS validation, rate limiting, log review, and OWASP-relevant API testing are release gates.</w:t>
+            </w:r>
             <w:r>
               <w:rPr>
                 <w:rFonts w:ascii="Aptos" w:hAnsi="Aptos"/>
                 <w:b w:val="0"/>
                 <w:sz w:val="17"/>
               </w:rPr>
-              <w:t>Secret scan, dependency scan, CORS test, rate-limit behavior, no PII in logs, and OWASP-relevant API tests.</w:t>
             </w:r>
           </w:p>
         </w:tc>
@@ -8416,7 +8237,9 @@
             <w:pPr>
               <w:spacing w:after="40"/>
             </w:pPr>
-            <w:r/>
+            <w:r>
+              <w:t>Environment</w:t>
+            </w:r>
             <w:r>
               <w:rPr>
                 <w:rFonts w:ascii="Aptos" w:hAnsi="Aptos"/>
@@ -8424,7 +8247,6 @@
                 <w:color w:val="FFFFFF"/>
                 <w:sz w:val="17"/>
               </w:rPr>
-              <w:t>Environment</w:t>
             </w:r>
           </w:p>
         </w:tc>
@@ -8444,7 +8266,9 @@
             <w:pPr>
               <w:spacing w:after="40"/>
             </w:pPr>
-            <w:r/>
+            <w:r>
+              <w:t>Live deployment / release requirement</w:t>
+            </w:r>
             <w:r>
               <w:rPr>
                 <w:rFonts w:ascii="Aptos" w:hAnsi="Aptos"/>
@@ -8452,7 +8276,6 @@
                 <w:color w:val="FFFFFF"/>
                 <w:sz w:val="17"/>
               </w:rPr>
-              <w:t>Deployment requirements</w:t>
             </w:r>
           </w:p>
         </w:tc>
@@ -8473,14 +8296,15 @@
             <w:pPr>
               <w:spacing w:after="40"/>
             </w:pPr>
-            <w:r/>
+            <w:r>
+              <w:t>Local development</w:t>
+            </w:r>
             <w:r>
               <w:rPr>
                 <w:rFonts w:ascii="Aptos" w:hAnsi="Aptos"/>
                 <w:b w:val="0"/>
                 <w:sz w:val="17"/>
               </w:rPr>
-              <w:t>Local development</w:t>
             </w:r>
           </w:p>
         </w:tc>
@@ -8499,14 +8323,15 @@
             <w:pPr>
               <w:spacing w:after="40"/>
             </w:pPr>
-            <w:r/>
+            <w:r>
+              <w:t>Docker Compose starts PostgreSQL 16 and Ollama. Spring Boot runs locally with environment variables; Vite runs the frontend. No .env.example is committed.</w:t>
+            </w:r>
             <w:r>
               <w:rPr>
                 <w:rFonts w:ascii="Aptos" w:hAnsi="Aptos"/>
                 <w:b w:val="0"/>
                 <w:sz w:val="17"/>
               </w:rPr>
-              <w:t>Docker Compose may run PostgreSQL. Frontend uses Vite dev server; Spring Boot runs with local profile; .env is ignored by Git and copied from .env.example.</w:t>
             </w:r>
           </w:p>
         </w:tc>
@@ -8528,14 +8353,15 @@
             <w:pPr>
               <w:spacing w:after="40"/>
             </w:pPr>
-            <w:r/>
+            <w:r>
+              <w:t>Test / staging</w:t>
+            </w:r>
             <w:r>
               <w:rPr>
                 <w:rFonts w:ascii="Aptos" w:hAnsi="Aptos"/>
                 <w:b w:val="0"/>
                 <w:sz w:val="17"/>
               </w:rPr>
-              <w:t>Test / staging</w:t>
             </w:r>
           </w:p>
         </w:tc>
@@ -8555,14 +8381,15 @@
             <w:pPr>
               <w:spacing w:after="40"/>
             </w:pPr>
-            <w:r/>
+            <w:r>
+              <w:t>Not currently configured. Before pilot, use separate database/secrets, controlled content, and end-to-end smoke tests.</w:t>
+            </w:r>
             <w:r>
               <w:rPr>
                 <w:rFonts w:ascii="Aptos" w:hAnsi="Aptos"/>
                 <w:b w:val="0"/>
                 <w:sz w:val="17"/>
               </w:rPr>
-              <w:t>Separate database, non-production secrets, test service data, controlled feature flags, and end-to-end smoke test on every release candidate.</w:t>
             </w:r>
           </w:p>
         </w:tc>
@@ -8583,14 +8410,15 @@
             <w:pPr>
               <w:spacing w:after="40"/>
             </w:pPr>
-            <w:r/>
+            <w:r>
+              <w:t>Production</w:t>
+            </w:r>
             <w:r>
               <w:rPr>
                 <w:rFonts w:ascii="Aptos" w:hAnsi="Aptos"/>
                 <w:b w:val="0"/>
                 <w:sz w:val="17"/>
               </w:rPr>
-              <w:t>Production</w:t>
             </w:r>
           </w:p>
         </w:tc>
@@ -8609,14 +8437,15 @@
             <w:pPr>
               <w:spacing w:after="40"/>
             </w:pPr>
-            <w:r/>
+            <w:r>
+              <w:t>Not currently deployed as a managed production stack. Add TLS, backups, restricted admin access, monitoring, and rollback before production.</w:t>
+            </w:r>
             <w:r>
               <w:rPr>
                 <w:rFonts w:ascii="Aptos" w:hAnsi="Aptos"/>
                 <w:b w:val="0"/>
                 <w:sz w:val="17"/>
               </w:rPr>
-              <w:t>Static frontend on Vercel/Netlify; Spring Boot and PostgreSQL on managed platform; TLS, backups, database migrations, monitoring, restricted admin access, and deployment rollback.</w:t>
             </w:r>
           </w:p>
         </w:tc>
@@ -8638,14 +8467,15 @@
             <w:pPr>
               <w:spacing w:after="40"/>
             </w:pPr>
-            <w:r/>
+            <w:r>
+              <w:t>Configuration</w:t>
+            </w:r>
             <w:r>
               <w:rPr>
                 <w:rFonts w:ascii="Aptos" w:hAnsi="Aptos"/>
                 <w:b w:val="0"/>
                 <w:sz w:val="17"/>
               </w:rPr>
-              <w:t>Configuration</w:t>
             </w:r>
           </w:p>
         </w:tc>
@@ -8665,14 +8495,15 @@
             <w:pPr>
               <w:spacing w:after="40"/>
             </w:pPr>
-            <w:r/>
+            <w:r>
+              <w:t>DATABASE_URL, DATABASE_USERNAME, DATABASE_PASSWORD, CORS_ORIGIN, AI_SUMMARY_ENABLED, DEMO_RAG_ENABLED, OLLAMA_BASE_URL, and OLLAMA_MODEL are environment-specific.</w:t>
+            </w:r>
             <w:r>
               <w:rPr>
                 <w:rFonts w:ascii="Aptos" w:hAnsi="Aptos"/>
                 <w:b w:val="0"/>
                 <w:sz w:val="17"/>
               </w:rPr>
-              <w:t>CORS_ORIGIN, database URL/user/password, OPENAI_API_KEY, ENABLE_AI_SUMMARY, service directory mode, rate limits, and log level are environment-specific.</w:t>
             </w:r>
           </w:p>
         </w:tc>
@@ -8693,14 +8524,15 @@
             <w:pPr>
               <w:spacing w:after="40"/>
             </w:pPr>
-            <w:r/>
+            <w:r>
+              <w:t>Database migration</w:t>
+            </w:r>
             <w:r>
               <w:rPr>
                 <w:rFonts w:ascii="Aptos" w:hAnsi="Aptos"/>
                 <w:b w:val="0"/>
                 <w:sz w:val="17"/>
               </w:rPr>
-              <w:t>Database migration</w:t>
             </w:r>
           </w:p>
         </w:tc>
@@ -8719,14 +8551,15 @@
             <w:pPr>
               <w:spacing w:after="40"/>
             </w:pPr>
-            <w:r/>
+            <w:r>
+              <w:t>schema.sql and data.sql initialize the demo. Add Flyway or Liquibase and governed migration/version practices before production.</w:t>
+            </w:r>
             <w:r>
               <w:rPr>
                 <w:rFonts w:ascii="Aptos" w:hAnsi="Aptos"/>
                 <w:b w:val="0"/>
                 <w:sz w:val="17"/>
               </w:rPr>
-              <w:t>Use Flyway or Liquibase before production launch. Migrations must be reversible where possible and version safety/content records.</w:t>
             </w:r>
           </w:p>
         </w:tc>
@@ -8782,7 +8615,9 @@
             <w:pPr>
               <w:spacing w:after="40"/>
             </w:pPr>
-            <w:r/>
+            <w:r>
+              <w:t>Workstream</w:t>
+            </w:r>
             <w:r>
               <w:rPr>
                 <w:rFonts w:ascii="Aptos" w:hAnsi="Aptos"/>
@@ -8790,7 +8625,6 @@
                 <w:color w:val="FFFFFF"/>
                 <w:sz w:val="17"/>
               </w:rPr>
-              <w:t>Workstream</w:t>
             </w:r>
           </w:p>
         </w:tc>
@@ -8810,7 +8644,9 @@
             <w:pPr>
               <w:spacing w:after="40"/>
             </w:pPr>
-            <w:r/>
+            <w:r>
+              <w:t>Live deliverable / next action</w:t>
+            </w:r>
             <w:r>
               <w:rPr>
                 <w:rFonts w:ascii="Aptos" w:hAnsi="Aptos"/>
@@ -8818,7 +8654,6 @@
                 <w:color w:val="FFFFFF"/>
                 <w:sz w:val="17"/>
               </w:rPr>
-              <w:t>Deliverable</w:t>
             </w:r>
           </w:p>
         </w:tc>
@@ -8838,7 +8673,9 @@
             <w:pPr>
               <w:spacing w:after="40"/>
             </w:pPr>
-            <w:r/>
+            <w:r>
+              <w:t>Primary owner</w:t>
+            </w:r>
             <w:r>
               <w:rPr>
                 <w:rFonts w:ascii="Aptos" w:hAnsi="Aptos"/>
@@ -8846,7 +8683,6 @@
                 <w:color w:val="FFFFFF"/>
                 <w:sz w:val="17"/>
               </w:rPr>
-              <w:t>Primary owner</w:t>
             </w:r>
           </w:p>
         </w:tc>
@@ -8867,14 +8703,15 @@
             <w:pPr>
               <w:spacing w:after="40"/>
             </w:pPr>
-            <w:r/>
+            <w:r>
+              <w:t>Safety and content</w:t>
+            </w:r>
             <w:r>
               <w:rPr>
                 <w:rFonts w:ascii="Aptos" w:hAnsi="Aptos"/>
                 <w:b w:val="0"/>
                 <w:sz w:val="17"/>
               </w:rPr>
-              <w:t>Safety and content</w:t>
             </w:r>
           </w:p>
         </w:tc>
@@ -8893,14 +8730,15 @@
             <w:pPr>
               <w:spacing w:after="40"/>
             </w:pPr>
-            <w:r/>
+            <w:r>
+              <w:t>Demo pathways, criteria, guidance, and source records. Approve content and governance before pilot.</w:t>
+            </w:r>
             <w:r>
               <w:rPr>
                 <w:rFonts w:ascii="Aptos" w:hAnsi="Aptos"/>
                 <w:b w:val="0"/>
                 <w:sz w:val="17"/>
               </w:rPr>
-              <w:t>Approved symptom catalogue, urgent signs, rules, Bengali/English copy, version governance.</w:t>
             </w:r>
           </w:p>
         </w:tc>
@@ -8919,14 +8757,15 @@
             <w:pPr>
               <w:spacing w:after="40"/>
             </w:pPr>
-            <w:r/>
+            <w:r>
+              <w:t>Clinical/content reviewer</w:t>
+            </w:r>
             <w:r>
               <w:rPr>
                 <w:rFonts w:ascii="Aptos" w:hAnsi="Aptos"/>
                 <w:b w:val="0"/>
                 <w:sz w:val="17"/>
               </w:rPr>
-              <w:t>Product + clinical/content reviewer</w:t>
             </w:r>
           </w:p>
         </w:tc>
@@ -8948,14 +8787,15 @@
             <w:pPr>
               <w:spacing w:after="40"/>
             </w:pPr>
-            <w:r/>
+            <w:r>
+              <w:t>Frontend</w:t>
+            </w:r>
             <w:r>
               <w:rPr>
                 <w:rFonts w:ascii="Aptos" w:hAnsi="Aptos"/>
                 <w:b w:val="0"/>
                 <w:sz w:val="17"/>
               </w:rPr>
-              <w:t>Frontend</w:t>
             </w:r>
           </w:p>
         </w:tc>
@@ -8975,14 +8815,15 @@
             <w:pPr>
               <w:spacing w:after="40"/>
             </w:pPr>
-            <w:r/>
+            <w:r>
+              <w:t>Responsive bilingual journey, static service cards, share/copy, optional speech input, and back/restart. Add regression tests and accessibility audit.</w:t>
+            </w:r>
             <w:r>
               <w:rPr>
                 <w:rFonts w:ascii="Aptos" w:hAnsi="Aptos"/>
                 <w:b w:val="0"/>
                 <w:sz w:val="17"/>
               </w:rPr>
-              <w:t>Responsive bilingual flow, PWA, share/copy, voice fallback, accessibility and UI tests.</w:t>
             </w:r>
           </w:p>
         </w:tc>
@@ -9002,14 +8843,15 @@
             <w:pPr>
               <w:spacing w:after="40"/>
             </w:pPr>
-            <w:r/>
+            <w:r>
+              <w:t>Frontend engineer</w:t>
+            </w:r>
             <w:r>
               <w:rPr>
                 <w:rFonts w:ascii="Aptos" w:hAnsi="Aptos"/>
                 <w:b w:val="0"/>
                 <w:sz w:val="17"/>
               </w:rPr>
-              <w:t>Frontend engineer</w:t>
             </w:r>
           </w:p>
         </w:tc>
@@ -9030,14 +8872,15 @@
             <w:pPr>
               <w:spacing w:after="40"/>
             </w:pPr>
-            <w:r/>
+            <w:r>
+              <w:t>Backend</w:t>
+            </w:r>
             <w:r>
               <w:rPr>
                 <w:rFonts w:ascii="Aptos" w:hAnsi="Aptos"/>
                 <w:b w:val="0"/>
                 <w:sz w:val="17"/>
               </w:rPr>
-              <w:t>Backend</w:t>
             </w:r>
           </w:p>
         </w:tc>
@@ -9056,14 +8899,15 @@
             <w:pPr>
               <w:spacing w:after="40"/>
             </w:pPr>
-            <w:r/>
+            <w:r>
+              <w:t>Routing and explanation endpoints, PostgreSQL retrieval, Ollama policy/fallback, and health. Add integration tests and production hardening.</w:t>
+            </w:r>
             <w:r>
               <w:rPr>
                 <w:rFonts w:ascii="Aptos" w:hAnsi="Aptos"/>
                 <w:b w:val="0"/>
                 <w:sz w:val="17"/>
               </w:rPr>
-              <w:t>Routing rules API, service directory API, flags, AI guardrails, observability.</w:t>
             </w:r>
           </w:p>
         </w:tc>
@@ -9082,14 +8926,15 @@
             <w:pPr>
               <w:spacing w:after="40"/>
             </w:pPr>
-            <w:r/>
+            <w:r>
+              <w:t>Java backend engineer</w:t>
+            </w:r>
             <w:r>
               <w:rPr>
                 <w:rFonts w:ascii="Aptos" w:hAnsi="Aptos"/>
                 <w:b w:val="0"/>
                 <w:sz w:val="17"/>
               </w:rPr>
-              <w:t>Java backend engineer</w:t>
             </w:r>
           </w:p>
         </w:tc>
@@ -9111,14 +8956,15 @@
             <w:pPr>
               <w:spacing w:after="40"/>
             </w:pPr>
-            <w:r/>
+            <w:r>
+              <w:t>Data and operations</w:t>
+            </w:r>
             <w:r>
               <w:rPr>
                 <w:rFonts w:ascii="Aptos" w:hAnsi="Aptos"/>
                 <w:b w:val="0"/>
                 <w:sz w:val="17"/>
               </w:rPr>
-              <w:t>Data and operations</w:t>
             </w:r>
           </w:p>
         </w:tc>
@@ -9138,14 +8984,15 @@
             <w:pPr>
               <w:spacing w:after="40"/>
             </w:pPr>
-            <w:r/>
+            <w:r>
+              <w:t>Demo PostgreSQL schema/seeds and Compose runbook. Add migrations, backups, access controls, and live service-directory integration.</w:t>
+            </w:r>
             <w:r>
               <w:rPr>
                 <w:rFonts w:ascii="Aptos" w:hAnsi="Aptos"/>
                 <w:b w:val="0"/>
                 <w:sz w:val="17"/>
               </w:rPr>
-              <w:t>PostgreSQL schema, migrations, service-data update process, backups and access controls.</w:t>
             </w:r>
           </w:p>
         </w:tc>
@@ -9165,14 +9012,15 @@
             <w:pPr>
               <w:spacing w:after="40"/>
             </w:pPr>
-            <w:r/>
+            <w:r>
+              <w:t>Platform owner</w:t>
+            </w:r>
             <w:r>
               <w:rPr>
                 <w:rFonts w:ascii="Aptos" w:hAnsi="Aptos"/>
                 <w:b w:val="0"/>
                 <w:sz w:val="17"/>
               </w:rPr>
-              <w:t>Backend / platform owner</w:t>
             </w:r>
           </w:p>
         </w:tc>
@@ -9193,14 +9041,15 @@
             <w:pPr>
               <w:spacing w:after="40"/>
             </w:pPr>
-            <w:r/>
+            <w:r>
+              <w:t>Quality assurance</w:t>
+            </w:r>
             <w:r>
               <w:rPr>
                 <w:rFonts w:ascii="Aptos" w:hAnsi="Aptos"/>
                 <w:b w:val="0"/>
                 <w:sz w:val="17"/>
               </w:rPr>
-              <w:t>Quality assurance</w:t>
             </w:r>
           </w:p>
         </w:tc>
@@ -9219,14 +9068,15 @@
             <w:pPr>
               <w:spacing w:after="40"/>
             </w:pPr>
-            <w:r/>
+            <w:r>
+              <w:t>Existing Java unit tests and manual demo checks. Establish route regression matrix and mobile/e2e evidence before pilot.</w:t>
+            </w:r>
             <w:r>
               <w:rPr>
                 <w:rFonts w:ascii="Aptos" w:hAnsi="Aptos"/>
                 <w:b w:val="0"/>
                 <w:sz w:val="17"/>
               </w:rPr>
-              <w:t>Test matrix, route regression suite, device checks, error/fallback validation.</w:t>
             </w:r>
           </w:p>
         </w:tc>
@@ -9245,14 +9095,15 @@
             <w:pPr>
               <w:spacing w:after="40"/>
             </w:pPr>
-            <w:r/>
+            <w:r>
+              <w:t>QA engineer</w:t>
+            </w:r>
             <w:r>
               <w:rPr>
                 <w:rFonts w:ascii="Aptos" w:hAnsi="Aptos"/>
                 <w:b w:val="0"/>
                 <w:sz w:val="17"/>
               </w:rPr>
-              <w:t>QA engineer</w:t>
             </w:r>
           </w:p>
         </w:tc>
@@ -9274,14 +9125,15 @@
             <w:pPr>
               <w:spacing w:after="40"/>
             </w:pPr>
-            <w:r/>
+            <w:r>
+              <w:t>Outreach operations</w:t>
+            </w:r>
             <w:r>
               <w:rPr>
                 <w:rFonts w:ascii="Aptos" w:hAnsi="Aptos"/>
                 <w:b w:val="0"/>
                 <w:sz w:val="17"/>
               </w:rPr>
-              <w:t>Outreach operations</w:t>
             </w:r>
           </w:p>
         </w:tc>
@@ -9301,14 +9153,15 @@
             <w:pPr>
               <w:spacing w:after="40"/>
             </w:pPr>
-            <w:r/>
+            <w:r>
+              <w:t>No live facility verification process is implemented. Establish verification, update cadence, and escalation contacts before pilot.</w:t>
+            </w:r>
             <w:r>
               <w:rPr>
                 <w:rFonts w:ascii="Aptos" w:hAnsi="Aptos"/>
                 <w:b w:val="0"/>
                 <w:sz w:val="17"/>
               </w:rPr>
-              <w:t>Eye-camp, vision-centre, PHC, clinic/hospital information verification and update cadence.</w:t>
             </w:r>
           </w:p>
         </w:tc>
@@ -9328,14 +9181,15 @@
             <w:pPr>
               <w:spacing w:after="40"/>
             </w:pPr>
-            <w:r/>
+            <w:r>
+              <w:t>Operations owner</w:t>
+            </w:r>
             <w:r>
               <w:rPr>
                 <w:rFonts w:ascii="Aptos" w:hAnsi="Aptos"/>
                 <w:b w:val="0"/>
                 <w:sz w:val="17"/>
               </w:rPr>
-              <w:t>Outreach coordinator</w:t>
             </w:r>
           </w:p>
         </w:tc>
@@ -9369,7 +9223,7 @@
           <w:color w:val="263D48"/>
           <w:sz w:val="20"/>
         </w:rPr>
-        <w:t>The MVP chooses a deterministic Java rules module because the product’s most consequential decision is urgency. React/PWA maximises Android-friendly access without an app-store barrier. PostgreSQL and JPA provide governed content and service data. OpenAI is intentionally isolated behind a Spring Boot service, feature flag, schema validation, safety policy checks, and an approved fallback. This architecture keeps the core patient value available even when optional AI or location services are unavailable.</w:t>
+        <w:t>The MVP uses Java deterministic routing because urgency is the most consequential decision. React/Vite provides Android-friendly browser access. PostgreSQL stores demo clinical pathways, criteria, sources, and route guidance. Local Ollama is isolated behind Java, PostgreSQL RAG retrieval, safety policy validation, feature flags, and fixed fallback content. The core route remains available when Ollama is unavailable. All current database content is demo-simulated and not clinically approved.</w:t>
       </w:r>
     </w:p>
     <w:sectPr>
@@ -9396,7 +9250,7 @@
         <w:color w:val="516772"/>
         <w:sz w:val="16"/>
       </w:rPr>
-      <w:t>Confidential capstone product documentation  |  Version 1.0  |  August 2026</w:t>
+      <w:t>Capstone technical product documentation</w:t>
     </w:r>
   </w:p>
 </w:ftr>

</xml_diff>

<commit_message>
Add wireframe reference to technical PRD
</commit_message>
<xml_diff>
--- a/documentation/NetraJyoti_AI_Technical_PRD.docx
+++ b/documentation/NetraJyoti_AI_Technical_PRD.docx
@@ -616,6 +616,28 @@
                 <w:b w:val="0"/>
                 <w:sz w:val="17"/>
               </w:rPr>
+            </w:r>
+          </w:p>
+        </w:tc>
+      </w:tr>
+      <w:tr>
+        <w:tc>
+          <w:tcPr>
+            <w:tcW w:type="dxa" w:w="4997"/>
+          </w:tcPr>
+          <w:p>
+            <w:r>
+              <w:t>Wireframe reference</w:t>
+            </w:r>
+          </w:p>
+        </w:tc>
+        <w:tc>
+          <w:tcPr>
+            <w:tcW w:type="dxa" w:w="4997"/>
+          </w:tcPr>
+          <w:p>
+            <w:r>
+              <w:t>Published live wireframe: https://rahulkarcj.github.io/netrajyoti-ai-mvp/</w:t>
             </w:r>
           </w:p>
         </w:tc>
@@ -1092,7 +1114,7 @@
           <w:color w:val="263D48"/>
           <w:sz w:val="20"/>
         </w:rPr>
-        <w:t>This end-to-end workflow and its screen identifiers are aligned with the published NetraJyoti wireframe for the current live capstone MVP. The wireframe is the visual representation of this flow for capstone review and demo validation. Pilot and production readiness gaps - including clinically approved content, live facility verification, access controls, automated test coverage, and managed deployment - are documented explicitly as future release gates, not as current capabilities. The browser keeps only transient journey state, and every result offers back or restart navigation.</w:t>
+        <w:t>This end-to-end workflow and its screen identifiers are aligned with the published NetraJyoti wireframe for the current live capstone MVP. The wireframe is the visual representation of this flow for capstone review and demo validation. Reference: https://rahulkarcj.github.io/netrajyoti-ai-mvp/ Pilot and production readiness gaps - including clinically approved content, live facility verification, access controls, automated test coverage, and managed deployment - are documented explicitly as future release gates, not as current capabilities. The browser keeps only transient journey state, and every result offers back or restart navigation.</w:t>
       </w:r>
     </w:p>
     <w:tbl>

</xml_diff>

<commit_message>
Improve technical PRD wireframe reference layout
</commit_message>
<xml_diff>
--- a/documentation/NetraJyoti_AI_Technical_PRD.docx
+++ b/documentation/NetraJyoti_AI_Technical_PRD.docx
@@ -90,6 +90,14 @@
         <w:spacing w:after="20"/>
       </w:pPr>
     </w:p>
+    <w:p>
+      <w:pPr>
+        <w:pStyle w:val="Heading1"/>
+      </w:pPr>
+      <w:r>
+        <w:t>Document control</w:t>
+      </w:r>
+    </w:p>
     <w:tbl>
       <w:tblPr>
         <w:tblW w:type="auto" w:w="0"/>
@@ -118,19 +126,8 @@
             </w:tcMar>
           </w:tcPr>
           <w:p>
-            <w:pPr>
-              <w:spacing w:after="40"/>
-            </w:pPr>
-            <w:r>
-              <w:t>Document control</w:t>
-            </w:r>
-            <w:r>
-              <w:rPr>
-                <w:rFonts w:ascii="Aptos" w:hAnsi="Aptos"/>
-                <w:b/>
-                <w:color w:val="FFFFFF"/>
-                <w:sz w:val="17"/>
-              </w:rPr>
+            <w:r>
+              <w:t>Field</w:t>
             </w:r>
           </w:p>
         </w:tc>
@@ -147,19 +144,8 @@
             </w:tcMar>
           </w:tcPr>
           <w:p>
-            <w:pPr>
-              <w:spacing w:after="40"/>
-            </w:pPr>
             <w:r>
               <w:t>Value</w:t>
-            </w:r>
-            <w:r>
-              <w:rPr>
-                <w:rFonts w:ascii="Aptos" w:hAnsi="Aptos"/>
-                <w:b/>
-                <w:color w:val="FFFFFF"/>
-                <w:sz w:val="17"/>
-              </w:rPr>
             </w:r>
           </w:p>
         </w:tc>
@@ -1105,16 +1091,28 @@
       </w:r>
     </w:p>
     <w:p>
+      <w:r>
+        <w:t xml:space="preserve">Published wireframe: </w:t>
+      </w:r>
+      <w:hyperlink r:id="rId11">
+        <w:r>
+          <w:rPr>
+            <w:color w:val="008C83"/>
+            <w:u w:val="single"/>
+          </w:rPr>
+          <w:t>NetraJyoti live wireframe (GitHub Pages)</w:t>
+        </w:r>
+      </w:hyperlink>
+      <w:r>
+        <w:t xml:space="preserve"> - https://rahulkarcj.github.io/netrajyoti-ai-mvp/</w:t>
+      </w:r>
+    </w:p>
+    <w:p>
       <w:pPr>
         <w:spacing w:after="120" w:line="269" w:lineRule="auto"/>
       </w:pPr>
       <w:r>
-        <w:rPr>
-          <w:rFonts w:ascii="Aptos" w:hAnsi="Aptos"/>
-          <w:color w:val="263D48"/>
-          <w:sz w:val="20"/>
-        </w:rPr>
-        <w:t>This end-to-end workflow and its screen identifiers are aligned with the published NetraJyoti wireframe for the current live capstone MVP. The wireframe is the visual representation of this flow for capstone review and demo validation. Reference: https://rahulkarcj.github.io/netrajyoti-ai-mvp/ Pilot and production readiness gaps - including clinically approved content, live facility verification, access controls, automated test coverage, and managed deployment - are documented explicitly as future release gates, not as current capabilities. The browser keeps only transient journey state, and every result offers back or restart navigation.</w:t>
+        <w:t>This end-to-end workflow and its screen identifiers are aligned with the current live capstone MVP. The published wireframe is the visual representation used for capstone review and demo validation.</w:t>
       </w:r>
     </w:p>
     <w:tbl>

</xml_diff>

<commit_message>
Add workflow diagram to technical PRD
</commit_message>
<xml_diff>
--- a/documentation/NetraJyoti_AI_Technical_PRD.docx
+++ b/documentation/NetraJyoti_AI_Technical_PRD.docx
@@ -1088,6 +1088,368 @@
           <w:color w:val="123C4A"/>
         </w:rPr>
         <w:t>2. End-to-end workflow and routing</w:t>
+      </w:r>
+    </w:p>
+    <w:tbl>
+      <w:tblPr>
+        <w:tblW w:type="dxa" w:w="9360"/>
+        <w:tblLayout w:type="fixed"/>
+        <w:tblLook w:firstColumn="1" w:firstRow="1" w:lastColumn="0" w:lastRow="0" w:noHBand="0" w:noVBand="1" w:val="04A0"/>
+      </w:tblPr>
+      <w:tblGrid>
+        <w:gridCol w:w="1600"/>
+        <w:gridCol w:w="340"/>
+        <w:gridCol w:w="1600"/>
+        <w:gridCol w:w="340"/>
+        <w:gridCol w:w="1600"/>
+        <w:gridCol w:w="340"/>
+        <w:gridCol w:w="1600"/>
+        <w:gridCol w:w="340"/>
+        <w:gridCol w:w="1600"/>
+      </w:tblGrid>
+      <w:tr>
+        <w:tc>
+          <w:tcPr>
+            <w:tcW w:type="dxa" w:w="1600"/>
+            <w:vAlign w:val="center"/>
+            <w:shd w:fill="E6F4F1" w:val="clear"/>
+            <w:tcBorders>
+              <w:top w:val="single" w:sz="8" w:space="0" w:color="86CFC6"/>
+              <w:left w:val="single" w:sz="8" w:space="0" w:color="86CFC6"/>
+              <w:bottom w:val="single" w:sz="8" w:space="0" w:color="86CFC6"/>
+              <w:right w:val="single" w:sz="8" w:space="0" w:color="86CFC6"/>
+            </w:tcBorders>
+            <w:tcMar>
+              <w:top w:w="100" w:type="dxa"/>
+              <w:start w:w="90" w:type="dxa"/>
+              <w:bottom w:w="100" w:type="dxa"/>
+              <w:end w:w="90" w:type="dxa"/>
+            </w:tcMar>
+          </w:tcPr>
+          <w:p>
+            <w:pPr>
+              <w:spacing w:after="0"/>
+              <w:jc w:val="center"/>
+            </w:pPr>
+            <w:r/>
+            <w:r>
+              <w:rPr>
+                <w:b/>
+                <w:color w:val="174555"/>
+                <w:sz w:val="17"/>
+              </w:rPr>
+              <w:t>Start journey</w:t>
+            </w:r>
+            <w:r>
+              <w:rPr>
+                <w:color w:val="174555"/>
+                <w:sz w:val="14"/>
+              </w:rPr>
+              <w:br/>
+              <w:t>Consent + concerns</w:t>
+            </w:r>
+          </w:p>
+        </w:tc>
+        <w:tc>
+          <w:tcPr>
+            <w:tcW w:type="dxa" w:w="340"/>
+            <w:vAlign w:val="center"/>
+            <w:tcMar>
+              <w:top w:w="0" w:type="dxa"/>
+              <w:start w:w="0" w:type="dxa"/>
+              <w:bottom w:w="0" w:type="dxa"/>
+              <w:end w:w="0" w:type="dxa"/>
+            </w:tcMar>
+          </w:tcPr>
+          <w:p>
+            <w:pPr>
+              <w:jc w:val="center"/>
+            </w:pPr>
+            <w:r/>
+            <w:r>
+              <w:rPr>
+                <w:b/>
+                <w:color w:val="008C83"/>
+                <w:sz w:val="30"/>
+              </w:rPr>
+              <w:t>→</w:t>
+            </w:r>
+          </w:p>
+        </w:tc>
+        <w:tc>
+          <w:tcPr>
+            <w:tcW w:type="dxa" w:w="1600"/>
+            <w:vAlign w:val="center"/>
+            <w:shd w:fill="FFF2D9" w:val="clear"/>
+            <w:tcBorders>
+              <w:top w:val="single" w:sz="8" w:space="0" w:color="E0AD56"/>
+              <w:left w:val="single" w:sz="8" w:space="0" w:color="E0AD56"/>
+              <w:bottom w:val="single" w:sz="8" w:space="0" w:color="E0AD56"/>
+              <w:right w:val="single" w:sz="8" w:space="0" w:color="E0AD56"/>
+            </w:tcBorders>
+            <w:tcMar>
+              <w:top w:w="100" w:type="dxa"/>
+              <w:start w:w="90" w:type="dxa"/>
+              <w:bottom w:w="100" w:type="dxa"/>
+              <w:end w:w="90" w:type="dxa"/>
+            </w:tcMar>
+          </w:tcPr>
+          <w:p>
+            <w:pPr>
+              <w:spacing w:after="0"/>
+              <w:jc w:val="center"/>
+            </w:pPr>
+            <w:r/>
+            <w:r>
+              <w:rPr>
+                <w:b/>
+                <w:color w:val="174555"/>
+                <w:sz w:val="17"/>
+              </w:rPr>
+              <w:t>Safety review</w:t>
+            </w:r>
+            <w:r>
+              <w:rPr>
+                <w:color w:val="174555"/>
+                <w:sz w:val="14"/>
+              </w:rPr>
+              <w:br/>
+              <w:t>Urgent signs + history</w:t>
+            </w:r>
+          </w:p>
+        </w:tc>
+        <w:tc>
+          <w:tcPr>
+            <w:tcW w:type="dxa" w:w="340"/>
+            <w:vAlign w:val="center"/>
+            <w:tcMar>
+              <w:top w:w="0" w:type="dxa"/>
+              <w:start w:w="0" w:type="dxa"/>
+              <w:bottom w:w="0" w:type="dxa"/>
+              <w:end w:w="0" w:type="dxa"/>
+            </w:tcMar>
+          </w:tcPr>
+          <w:p>
+            <w:pPr>
+              <w:jc w:val="center"/>
+            </w:pPr>
+            <w:r/>
+            <w:r>
+              <w:rPr>
+                <w:b/>
+                <w:color w:val="008C83"/>
+                <w:sz w:val="30"/>
+              </w:rPr>
+              <w:t>→</w:t>
+            </w:r>
+          </w:p>
+        </w:tc>
+        <w:tc>
+          <w:tcPr>
+            <w:tcW w:type="dxa" w:w="1600"/>
+            <w:vAlign w:val="center"/>
+            <w:shd w:fill="164958" w:val="clear"/>
+            <w:tcBorders>
+              <w:top w:val="single" w:sz="8" w:space="0" w:color="164958"/>
+              <w:left w:val="single" w:sz="8" w:space="0" w:color="164958"/>
+              <w:bottom w:val="single" w:sz="8" w:space="0" w:color="164958"/>
+              <w:right w:val="single" w:sz="8" w:space="0" w:color="164958"/>
+            </w:tcBorders>
+            <w:tcMar>
+              <w:top w:w="100" w:type="dxa"/>
+              <w:start w:w="90" w:type="dxa"/>
+              <w:bottom w:w="100" w:type="dxa"/>
+              <w:end w:w="90" w:type="dxa"/>
+            </w:tcMar>
+          </w:tcPr>
+          <w:p>
+            <w:pPr>
+              <w:spacing w:after="0"/>
+              <w:jc w:val="center"/>
+            </w:pPr>
+            <w:r/>
+            <w:r>
+              <w:rPr>
+                <w:b/>
+                <w:color w:val="FFFFFF"/>
+                <w:sz w:val="17"/>
+              </w:rPr>
+              <w:t>Route locked</w:t>
+            </w:r>
+            <w:r>
+              <w:rPr>
+                <w:color w:val="FFFFFF"/>
+                <w:sz w:val="14"/>
+              </w:rPr>
+              <w:br/>
+              <w:t>Java + PostgreSQL</w:t>
+            </w:r>
+          </w:p>
+        </w:tc>
+        <w:tc>
+          <w:tcPr>
+            <w:tcW w:type="dxa" w:w="340"/>
+            <w:vAlign w:val="center"/>
+            <w:tcMar>
+              <w:top w:w="0" w:type="dxa"/>
+              <w:start w:w="0" w:type="dxa"/>
+              <w:bottom w:w="0" w:type="dxa"/>
+              <w:end w:w="0" w:type="dxa"/>
+            </w:tcMar>
+          </w:tcPr>
+          <w:p>
+            <w:pPr>
+              <w:jc w:val="center"/>
+            </w:pPr>
+            <w:r/>
+            <w:r>
+              <w:rPr>
+                <w:b/>
+                <w:color w:val="008C83"/>
+                <w:sz w:val="30"/>
+              </w:rPr>
+              <w:t>→</w:t>
+            </w:r>
+          </w:p>
+        </w:tc>
+        <w:tc>
+          <w:tcPr>
+            <w:tcW w:type="dxa" w:w="1600"/>
+            <w:vAlign w:val="center"/>
+            <w:shd w:fill="EAF1F8" w:val="clear"/>
+            <w:tcBorders>
+              <w:top w:val="single" w:sz="8" w:space="0" w:color="5A8ABB"/>
+              <w:left w:val="single" w:sz="8" w:space="0" w:color="5A8ABB"/>
+              <w:bottom w:val="single" w:sz="8" w:space="0" w:color="5A8ABB"/>
+              <w:right w:val="single" w:sz="8" w:space="0" w:color="5A8ABB"/>
+            </w:tcBorders>
+            <w:tcMar>
+              <w:top w:w="100" w:type="dxa"/>
+              <w:start w:w="90" w:type="dxa"/>
+              <w:bottom w:w="100" w:type="dxa"/>
+              <w:end w:w="90" w:type="dxa"/>
+            </w:tcMar>
+          </w:tcPr>
+          <w:p>
+            <w:pPr>
+              <w:spacing w:after="0"/>
+              <w:jc w:val="center"/>
+            </w:pPr>
+            <w:r/>
+            <w:r>
+              <w:rPr>
+                <w:b/>
+                <w:color w:val="174555"/>
+                <w:sz w:val="17"/>
+              </w:rPr>
+              <w:t>Route result</w:t>
+            </w:r>
+            <w:r>
+              <w:rPr>
+                <w:color w:val="174555"/>
+                <w:sz w:val="14"/>
+              </w:rPr>
+              <w:br/>
+              <w:t>Urgent | Routine | Human support</w:t>
+            </w:r>
+          </w:p>
+        </w:tc>
+        <w:tc>
+          <w:tcPr>
+            <w:tcW w:type="dxa" w:w="340"/>
+            <w:vAlign w:val="center"/>
+            <w:tcMar>
+              <w:top w:w="0" w:type="dxa"/>
+              <w:start w:w="0" w:type="dxa"/>
+              <w:bottom w:w="0" w:type="dxa"/>
+              <w:end w:w="0" w:type="dxa"/>
+            </w:tcMar>
+          </w:tcPr>
+          <w:p>
+            <w:pPr>
+              <w:jc w:val="center"/>
+            </w:pPr>
+            <w:r/>
+            <w:r>
+              <w:rPr>
+                <w:b/>
+                <w:color w:val="008C83"/>
+                <w:sz w:val="30"/>
+              </w:rPr>
+              <w:t>→</w:t>
+            </w:r>
+          </w:p>
+        </w:tc>
+        <w:tc>
+          <w:tcPr>
+            <w:tcW w:type="dxa" w:w="1600"/>
+            <w:vAlign w:val="center"/>
+            <w:shd w:fill="E6F4F1" w:val="clear"/>
+            <w:tcBorders>
+              <w:top w:val="single" w:sz="8" w:space="0" w:color="008C83"/>
+              <w:left w:val="single" w:sz="8" w:space="0" w:color="008C83"/>
+              <w:bottom w:val="single" w:sz="8" w:space="0" w:color="008C83"/>
+              <w:right w:val="single" w:sz="8" w:space="0" w:color="008C83"/>
+            </w:tcBorders>
+            <w:tcMar>
+              <w:top w:w="100" w:type="dxa"/>
+              <w:start w:w="90" w:type="dxa"/>
+              <w:bottom w:w="100" w:type="dxa"/>
+              <w:end w:w="90" w:type="dxa"/>
+            </w:tcMar>
+          </w:tcPr>
+          <w:p>
+            <w:pPr>
+              <w:spacing w:after="0"/>
+              <w:jc w:val="center"/>
+            </w:pPr>
+            <w:r/>
+            <w:r>
+              <w:rPr>
+                <w:b/>
+                <w:color w:val="174555"/>
+                <w:sz w:val="17"/>
+              </w:rPr>
+              <w:t>Next steps</w:t>
+            </w:r>
+            <w:r>
+              <w:rPr>
+                <w:color w:val="174555"/>
+                <w:sz w:val="14"/>
+              </w:rPr>
+              <w:br/>
+              <w:t>Route action + Back / Start again</w:t>
+            </w:r>
+          </w:p>
+        </w:tc>
+      </w:tr>
+    </w:tbl>
+    <w:p>
+      <w:pPr>
+        <w:spacing w:before="80" w:after="100"/>
+        <w:jc w:val="center"/>
+      </w:pPr>
+      <w:r>
+        <w:rPr>
+          <w:b/>
+          <w:color w:val="008C83"/>
+          <w:sz w:val="17"/>
+        </w:rPr>
+        <w:t>Figure 1. End-to-end workflow and routing</w:t>
+      </w:r>
+    </w:p>
+    <w:p>
+      <w:pPr>
+        <w:spacing w:after="160"/>
+        <w:jc w:val="center"/>
+      </w:pPr>
+      <w:r>
+        <w:rPr>
+          <w:i/>
+          <w:color w:val="466570"/>
+          <w:sz w:val="16"/>
+        </w:rPr>
+        <w:t>Java fixes the route before optional PostgreSQL RAG retrieval and local Ollama explanation. All results provide Back or Start again.</w:t>
       </w:r>
     </w:p>
     <w:p>

</xml_diff>